<commit_message>
feat: insertar capturas de pantalla en Word (prometheus, grafana login, dashboard)
</commit_message>
<xml_diff>
--- a/INFORME_TECNICO_MONITOREO_ELCHINO.docx
+++ b/INFORME_TECNICO_MONITOREO_ELCHINO.docx
@@ -1986,7 +1986,38 @@
     </w:p>
     <w:p>
       <w:r>
-        <w:t>[CAPTURA: Prometheus targets UP - todos los 6 targets en estado UP]</w:t>
+        <w:drawing>
+          <wp:inline xmlns:a="http://schemas.openxmlformats.org/drawingml/2006/main" xmlns:pic="http://schemas.openxmlformats.org/drawingml/2006/picture">
+            <wp:extent cx="5029200" cy="5233352"/>
+            <wp:docPr id="1" name="Picture 1"/>
+            <wp:cNvGraphicFramePr>
+              <a:graphicFrameLocks noChangeAspect="1"/>
+            </wp:cNvGraphicFramePr>
+            <a:graphic>
+              <a:graphicData uri="http://schemas.openxmlformats.org/drawingml/2006/picture">
+                <pic:pic>
+                  <pic:nvPicPr>
+                    <pic:cNvPr id="0" name="prometheus.png"/>
+                    <pic:cNvPicPr/>
+                  </pic:nvPicPr>
+                  <pic:blipFill>
+                    <a:blip r:embed="rId9"/>
+                    <a:stretch>
+                      <a:fillRect/>
+                    </a:stretch>
+                  </pic:blipFill>
+                  <pic:spPr>
+                    <a:xfrm>
+                      <a:off x="0" y="0"/>
+                      <a:ext cx="5029200" cy="5233352"/>
+                    </a:xfrm>
+                    <a:prstGeom prst="rect"/>
+                  </pic:spPr>
+                </pic:pic>
+              </a:graphicData>
+            </a:graphic>
+          </wp:inline>
+        </w:drawing>
       </w:r>
     </w:p>
     <w:p>
@@ -2021,7 +2052,38 @@
     </w:p>
     <w:p>
       <w:r>
-        <w:t>[CAPTURA: Login de Grafana (admin/admin)]</w:t>
+        <w:drawing>
+          <wp:inline xmlns:a="http://schemas.openxmlformats.org/drawingml/2006/main" xmlns:pic="http://schemas.openxmlformats.org/drawingml/2006/picture">
+            <wp:extent cx="5029200" cy="5477814"/>
+            <wp:docPr id="2" name="Picture 2"/>
+            <wp:cNvGraphicFramePr>
+              <a:graphicFrameLocks noChangeAspect="1"/>
+            </wp:cNvGraphicFramePr>
+            <a:graphic>
+              <a:graphicData uri="http://schemas.openxmlformats.org/drawingml/2006/picture">
+                <pic:pic>
+                  <pic:nvPicPr>
+                    <pic:cNvPr id="0" name="login-grafana.png"/>
+                    <pic:cNvPicPr/>
+                  </pic:nvPicPr>
+                  <pic:blipFill>
+                    <a:blip r:embed="rId10"/>
+                    <a:stretch>
+                      <a:fillRect/>
+                    </a:stretch>
+                  </pic:blipFill>
+                  <pic:spPr>
+                    <a:xfrm>
+                      <a:off x="0" y="0"/>
+                      <a:ext cx="5029200" cy="5477814"/>
+                    </a:xfrm>
+                    <a:prstGeom prst="rect"/>
+                  </pic:spPr>
+                </pic:pic>
+              </a:graphicData>
+            </a:graphic>
+          </wp:inline>
+        </w:drawing>
       </w:r>
     </w:p>
     <w:p>
@@ -3105,7 +3167,38 @@
     </w:p>
     <w:p>
       <w:r>
-        <w:t>[CAPTURA: Panel de estado general con los 6 servicios monitoreados]</w:t>
+        <w:drawing>
+          <wp:inline xmlns:a="http://schemas.openxmlformats.org/drawingml/2006/main" xmlns:pic="http://schemas.openxmlformats.org/drawingml/2006/picture">
+            <wp:extent cx="5029200" cy="5303008"/>
+            <wp:docPr id="3" name="Picture 3"/>
+            <wp:cNvGraphicFramePr>
+              <a:graphicFrameLocks noChangeAspect="1"/>
+            </wp:cNvGraphicFramePr>
+            <a:graphic>
+              <a:graphicData uri="http://schemas.openxmlformats.org/drawingml/2006/picture">
+                <pic:pic>
+                  <pic:nvPicPr>
+                    <pic:cNvPr id="0" name="grafana-dashboard-2.png"/>
+                    <pic:cNvPicPr/>
+                  </pic:nvPicPr>
+                  <pic:blipFill>
+                    <a:blip r:embed="rId12"/>
+                    <a:stretch>
+                      <a:fillRect/>
+                    </a:stretch>
+                  </pic:blipFill>
+                  <pic:spPr>
+                    <a:xfrm>
+                      <a:off x="0" y="0"/>
+                      <a:ext cx="5029200" cy="5303008"/>
+                    </a:xfrm>
+                    <a:prstGeom prst="rect"/>
+                  </pic:spPr>
+                </pic:pic>
+              </a:graphicData>
+            </a:graphic>
+          </wp:inline>
+        </w:drawing>
       </w:r>
     </w:p>
     <w:p>

</xml_diff>

<commit_message>
feat: insertar capturas node exporter en Word
</commit_message>
<xml_diff>
--- a/INFORME_TECNICO_MONITOREO_ELCHINO.docx
+++ b/INFORME_TECNICO_MONITOREO_ELCHINO.docx
@@ -1758,17 +1758,110 @@
     </w:p>
     <w:p>
       <w:r>
-        <w:t>[CAPTURA: Instalación de Node Exporter en EC2-1]</w:t>
+        <w:drawing>
+          <wp:inline xmlns:a="http://schemas.openxmlformats.org/drawingml/2006/main" xmlns:pic="http://schemas.openxmlformats.org/drawingml/2006/picture">
+            <wp:extent cx="5029200" cy="2011680"/>
+            <wp:docPr id="4" name="Picture 4"/>
+            <wp:cNvGraphicFramePr>
+              <a:graphicFrameLocks noChangeAspect="1"/>
+            </wp:cNvGraphicFramePr>
+            <a:graphic>
+              <a:graphicData uri="http://schemas.openxmlformats.org/drawingml/2006/picture">
+                <pic:pic>
+                  <pic:nvPicPr>
+                    <pic:cNvPr id="0" name="exporte-db.png"/>
+                    <pic:cNvPicPr/>
+                  </pic:nvPicPr>
+                  <pic:blipFill>
+                    <a:blip r:embed="rId13"/>
+                    <a:stretch>
+                      <a:fillRect/>
+                    </a:stretch>
+                  </pic:blipFill>
+                  <pic:spPr>
+                    <a:xfrm>
+                      <a:off x="0" y="0"/>
+                      <a:ext cx="5029200" cy="2011680"/>
+                    </a:xfrm>
+                    <a:prstGeom prst="rect"/>
+                  </pic:spPr>
+                </pic:pic>
+              </a:graphicData>
+            </a:graphic>
+          </wp:inline>
+        </w:drawing>
       </w:r>
     </w:p>
     <w:p>
       <w:r>
-        <w:t>[CAPTURA: Instalación de Node Exporter en EC2-2]</w:t>
+        <w:drawing>
+          <wp:inline xmlns:a="http://schemas.openxmlformats.org/drawingml/2006/main" xmlns:pic="http://schemas.openxmlformats.org/drawingml/2006/picture">
+            <wp:extent cx="5029200" cy="1888901"/>
+            <wp:docPr id="5" name="Picture 5"/>
+            <wp:cNvGraphicFramePr>
+              <a:graphicFrameLocks noChangeAspect="1"/>
+            </wp:cNvGraphicFramePr>
+            <a:graphic>
+              <a:graphicData uri="http://schemas.openxmlformats.org/drawingml/2006/picture">
+                <pic:pic>
+                  <pic:nvPicPr>
+                    <pic:cNvPr id="0" name="exporte-backend.png"/>
+                    <pic:cNvPicPr/>
+                  </pic:nvPicPr>
+                  <pic:blipFill>
+                    <a:blip r:embed="rId14"/>
+                    <a:stretch>
+                      <a:fillRect/>
+                    </a:stretch>
+                  </pic:blipFill>
+                  <pic:spPr>
+                    <a:xfrm>
+                      <a:off x="0" y="0"/>
+                      <a:ext cx="5029200" cy="1888901"/>
+                    </a:xfrm>
+                    <a:prstGeom prst="rect"/>
+                  </pic:spPr>
+                </pic:pic>
+              </a:graphicData>
+            </a:graphic>
+          </wp:inline>
+        </w:drawing>
       </w:r>
     </w:p>
     <w:p>
       <w:r>
-        <w:t>[CAPTURA: Instalación de Node Exporter en EC2-3]</w:t>
+        <w:drawing>
+          <wp:inline xmlns:a="http://schemas.openxmlformats.org/drawingml/2006/main" xmlns:pic="http://schemas.openxmlformats.org/drawingml/2006/picture">
+            <wp:extent cx="5029200" cy="2072953"/>
+            <wp:docPr id="6" name="Picture 6"/>
+            <wp:cNvGraphicFramePr>
+              <a:graphicFrameLocks noChangeAspect="1"/>
+            </wp:cNvGraphicFramePr>
+            <a:graphic>
+              <a:graphicData uri="http://schemas.openxmlformats.org/drawingml/2006/picture">
+                <pic:pic>
+                  <pic:nvPicPr>
+                    <pic:cNvPr id="0" name="exporte-front.png"/>
+                    <pic:cNvPicPr/>
+                  </pic:nvPicPr>
+                  <pic:blipFill>
+                    <a:blip r:embed="rId15"/>
+                    <a:stretch>
+                      <a:fillRect/>
+                    </a:stretch>
+                  </pic:blipFill>
+                  <pic:spPr>
+                    <a:xfrm>
+                      <a:off x="0" y="0"/>
+                      <a:ext cx="5029200" cy="2072953"/>
+                    </a:xfrm>
+                    <a:prstGeom prst="rect"/>
+                  </pic:spPr>
+                </pic:pic>
+              </a:graphicData>
+            </a:graphic>
+          </wp:inline>
+        </w:drawing>
       </w:r>
     </w:p>
     <w:p>

</xml_diff>

<commit_message>
feat: insertar diagrama arquitectura propuesta en Word
</commit_message>
<xml_diff>
--- a/INFORME_TECNICO_MONITOREO_ELCHINO.docx
+++ b/INFORME_TECNICO_MONITOREO_ELCHINO.docx
@@ -642,7 +642,38 @@
     </w:p>
     <w:p>
       <w:r>
-        <w:t>[CAPTURA: Diagrama de arquitectura con 4 servidores, flechas de scraping de Prometheus hacia los targets]</w:t>
+        <w:drawing>
+          <wp:inline xmlns:a="http://schemas.openxmlformats.org/drawingml/2006/main" xmlns:pic="http://schemas.openxmlformats.org/drawingml/2006/picture">
+            <wp:extent cx="5029200" cy="1256072"/>
+            <wp:docPr id="7" name="Picture 7"/>
+            <wp:cNvGraphicFramePr>
+              <a:graphicFrameLocks noChangeAspect="1"/>
+            </wp:cNvGraphicFramePr>
+            <a:graphic>
+              <a:graphicData uri="http://schemas.openxmlformats.org/drawingml/2006/picture">
+                <pic:pic>
+                  <pic:nvPicPr>
+                    <pic:cNvPr id="0" name="arquitectura-propuesta.png"/>
+                    <pic:cNvPicPr/>
+                  </pic:nvPicPr>
+                  <pic:blipFill>
+                    <a:blip r:embed="rId16"/>
+                    <a:stretch>
+                      <a:fillRect/>
+                    </a:stretch>
+                  </pic:blipFill>
+                  <pic:spPr>
+                    <a:xfrm>
+                      <a:off x="0" y="0"/>
+                      <a:ext cx="5029200" cy="1256072"/>
+                    </a:xfrm>
+                    <a:prstGeom prst="rect"/>
+                  </pic:spPr>
+                </pic:pic>
+              </a:graphicData>
+            </a:graphic>
+          </wp:inline>
+        </w:drawing>
       </w:r>
     </w:p>
     <w:p>

</xml_diff>

<commit_message>
feat: insertar diagrama arquitectura actual en Word
</commit_message>
<xml_diff>
--- a/INFORME_TECNICO_MONITOREO_ELCHINO.docx
+++ b/INFORME_TECNICO_MONITOREO_ELCHINO.docx
@@ -316,7 +316,38 @@
     </w:p>
     <w:p>
       <w:r>
-        <w:t>[CAPTURA: Diagrama de arquitectura actual con 3 servidores EC2 y sus conexiones]</w:t>
+        <w:drawing>
+          <wp:inline xmlns:a="http://schemas.openxmlformats.org/drawingml/2006/main" xmlns:pic="http://schemas.openxmlformats.org/drawingml/2006/picture">
+            <wp:extent cx="5029200" cy="920541"/>
+            <wp:docPr id="8" name="Picture 8"/>
+            <wp:cNvGraphicFramePr>
+              <a:graphicFrameLocks noChangeAspect="1"/>
+            </wp:cNvGraphicFramePr>
+            <a:graphic>
+              <a:graphicData uri="http://schemas.openxmlformats.org/drawingml/2006/picture">
+                <pic:pic>
+                  <pic:nvPicPr>
+                    <pic:cNvPr id="0" name="arquitectura-actual.png"/>
+                    <pic:cNvPicPr/>
+                  </pic:nvPicPr>
+                  <pic:blipFill>
+                    <a:blip r:embed="rId17"/>
+                    <a:stretch>
+                      <a:fillRect/>
+                    </a:stretch>
+                  </pic:blipFill>
+                  <pic:spPr>
+                    <a:xfrm>
+                      <a:off x="0" y="0"/>
+                      <a:ext cx="5029200" cy="920541"/>
+                    </a:xfrm>
+                    <a:prstGeom prst="rect"/>
+                  </pic:spPr>
+                </pic:pic>
+              </a:graphicData>
+            </a:graphic>
+          </wp:inline>
+        </w:drawing>
       </w:r>
     </w:p>
     <w:p>

</xml_diff>

<commit_message>
fix: restaurar .docx corrupto, agregar .gitattributes, formato APA 7, eliminar placeholders
</commit_message>
<xml_diff>
--- a/INFORME_TECNICO_MONITOREO_ELCHINO.docx
+++ b/INFORME_TECNICO_MONITOREO_ELCHINO.docx
@@ -96,9 +96,14 @@
             <w:tcW w:type="dxa" w:w="2160"/>
           </w:tcPr>
           <w:p>
+            <w:pPr>
+              <w:jc w:val="left"/>
+            </w:pPr>
             <w:r>
               <w:rPr>
+                <w:rFonts w:ascii="Arial" w:hAnsi="Arial"/>
                 <w:b/>
+                <w:sz w:val="20"/>
               </w:rPr>
               <w:t>Servidor</w:t>
             </w:r>
@@ -109,9 +114,14 @@
             <w:tcW w:type="dxa" w:w="2160"/>
           </w:tcPr>
           <w:p>
+            <w:pPr>
+              <w:jc w:val="left"/>
+            </w:pPr>
             <w:r>
               <w:rPr>
+                <w:rFonts w:ascii="Arial" w:hAnsi="Arial"/>
                 <w:b/>
+                <w:sz w:val="20"/>
               </w:rPr>
               <w:t>EC2</w:t>
             </w:r>
@@ -122,9 +132,14 @@
             <w:tcW w:type="dxa" w:w="2160"/>
           </w:tcPr>
           <w:p>
+            <w:pPr>
+              <w:jc w:val="left"/>
+            </w:pPr>
             <w:r>
               <w:rPr>
+                <w:rFonts w:ascii="Arial" w:hAnsi="Arial"/>
                 <w:b/>
+                <w:sz w:val="20"/>
               </w:rPr>
               <w:t>Función</w:t>
             </w:r>
@@ -135,9 +150,14 @@
             <w:tcW w:type="dxa" w:w="2160"/>
           </w:tcPr>
           <w:p>
+            <w:pPr>
+              <w:jc w:val="left"/>
+            </w:pPr>
             <w:r>
               <w:rPr>
+                <w:rFonts w:ascii="Arial" w:hAnsi="Arial"/>
                 <w:b/>
+                <w:sz w:val="20"/>
               </w:rPr>
               <w:t>Servicios / Puertos</w:t>
             </w:r>
@@ -150,7 +170,14 @@
             <w:tcW w:type="dxa" w:w="2160"/>
           </w:tcPr>
           <w:p>
+            <w:pPr>
+              <w:jc w:val="left"/>
+            </w:pPr>
             <w:r>
+              <w:rPr>
+                <w:rFonts w:ascii="Arial" w:hAnsi="Arial"/>
+                <w:sz w:val="20"/>
+              </w:rPr>
               <w:t>MongoDB</w:t>
             </w:r>
           </w:p>
@@ -160,7 +187,14 @@
             <w:tcW w:type="dxa" w:w="2160"/>
           </w:tcPr>
           <w:p>
+            <w:pPr>
+              <w:jc w:val="left"/>
+            </w:pPr>
             <w:r>
+              <w:rPr>
+                <w:rFonts w:ascii="Arial" w:hAnsi="Arial"/>
+                <w:sz w:val="20"/>
+              </w:rPr>
               <w:t>EC2-1</w:t>
             </w:r>
           </w:p>
@@ -170,7 +204,14 @@
             <w:tcW w:type="dxa" w:w="2160"/>
           </w:tcPr>
           <w:p>
+            <w:pPr>
+              <w:jc w:val="left"/>
+            </w:pPr>
             <w:r>
+              <w:rPr>
+                <w:rFonts w:ascii="Arial" w:hAnsi="Arial"/>
+                <w:sz w:val="20"/>
+              </w:rPr>
               <w:t>Base de datos</w:t>
             </w:r>
           </w:p>
@@ -180,7 +221,14 @@
             <w:tcW w:type="dxa" w:w="2160"/>
           </w:tcPr>
           <w:p>
+            <w:pPr>
+              <w:jc w:val="left"/>
+            </w:pPr>
             <w:r>
+              <w:rPr>
+                <w:rFonts w:ascii="Arial" w:hAnsi="Arial"/>
+                <w:sz w:val="20"/>
+              </w:rPr>
               <w:t>MongoDB 7 (27017)</w:t>
             </w:r>
           </w:p>
@@ -192,7 +240,14 @@
             <w:tcW w:type="dxa" w:w="2160"/>
           </w:tcPr>
           <w:p>
+            <w:pPr>
+              <w:jc w:val="left"/>
+            </w:pPr>
             <w:r>
+              <w:rPr>
+                <w:rFonts w:ascii="Arial" w:hAnsi="Arial"/>
+                <w:sz w:val="20"/>
+              </w:rPr>
               <w:t>Backend</w:t>
             </w:r>
           </w:p>
@@ -202,7 +257,14 @@
             <w:tcW w:type="dxa" w:w="2160"/>
           </w:tcPr>
           <w:p>
+            <w:pPr>
+              <w:jc w:val="left"/>
+            </w:pPr>
             <w:r>
+              <w:rPr>
+                <w:rFonts w:ascii="Arial" w:hAnsi="Arial"/>
+                <w:sz w:val="20"/>
+              </w:rPr>
               <w:t>EC2-2</w:t>
             </w:r>
           </w:p>
@@ -212,7 +274,14 @@
             <w:tcW w:type="dxa" w:w="2160"/>
           </w:tcPr>
           <w:p>
+            <w:pPr>
+              <w:jc w:val="left"/>
+            </w:pPr>
             <w:r>
+              <w:rPr>
+                <w:rFonts w:ascii="Arial" w:hAnsi="Arial"/>
+                <w:sz w:val="20"/>
+              </w:rPr>
               <w:t>API REST</w:t>
             </w:r>
           </w:p>
@@ -222,7 +291,14 @@
             <w:tcW w:type="dxa" w:w="2160"/>
           </w:tcPr>
           <w:p>
+            <w:pPr>
+              <w:jc w:val="left"/>
+            </w:pPr>
             <w:r>
+              <w:rPr>
+                <w:rFonts w:ascii="Arial" w:hAnsi="Arial"/>
+                <w:sz w:val="20"/>
+              </w:rPr>
               <w:t>Spring Boot WebFlux (30001 → 8087)</w:t>
             </w:r>
           </w:p>
@@ -234,7 +310,14 @@
             <w:tcW w:type="dxa" w:w="2160"/>
           </w:tcPr>
           <w:p>
+            <w:pPr>
+              <w:jc w:val="left"/>
+            </w:pPr>
             <w:r>
+              <w:rPr>
+                <w:rFonts w:ascii="Arial" w:hAnsi="Arial"/>
+                <w:sz w:val="20"/>
+              </w:rPr>
               <w:t>Frontend</w:t>
             </w:r>
           </w:p>
@@ -244,7 +327,14 @@
             <w:tcW w:type="dxa" w:w="2160"/>
           </w:tcPr>
           <w:p>
+            <w:pPr>
+              <w:jc w:val="left"/>
+            </w:pPr>
             <w:r>
+              <w:rPr>
+                <w:rFonts w:ascii="Arial" w:hAnsi="Arial"/>
+                <w:sz w:val="20"/>
+              </w:rPr>
               <w:t>EC2-3</w:t>
             </w:r>
           </w:p>
@@ -254,7 +344,14 @@
             <w:tcW w:type="dxa" w:w="2160"/>
           </w:tcPr>
           <w:p>
+            <w:pPr>
+              <w:jc w:val="left"/>
+            </w:pPr>
             <w:r>
+              <w:rPr>
+                <w:rFonts w:ascii="Arial" w:hAnsi="Arial"/>
+                <w:sz w:val="20"/>
+              </w:rPr>
               <w:t>Interfaz web</w:t>
             </w:r>
           </w:p>
@@ -264,7 +361,14 @@
             <w:tcW w:type="dxa" w:w="2160"/>
           </w:tcPr>
           <w:p>
+            <w:pPr>
+              <w:jc w:val="left"/>
+            </w:pPr>
             <w:r>
+              <w:rPr>
+                <w:rFonts w:ascii="Arial" w:hAnsi="Arial"/>
+                <w:sz w:val="20"/>
+              </w:rPr>
               <w:t>React + Vite + Nginx (30080 → 80)</w:t>
             </w:r>
           </w:p>
@@ -390,9 +494,14 @@
             <w:tcW w:type="dxa" w:w="2160"/>
           </w:tcPr>
           <w:p>
+            <w:pPr>
+              <w:jc w:val="left"/>
+            </w:pPr>
             <w:r>
               <w:rPr>
+                <w:rFonts w:ascii="Arial" w:hAnsi="Arial"/>
                 <w:b/>
+                <w:sz w:val="20"/>
               </w:rPr>
               <w:t>Servidor</w:t>
             </w:r>
@@ -403,9 +512,14 @@
             <w:tcW w:type="dxa" w:w="2160"/>
           </w:tcPr>
           <w:p>
+            <w:pPr>
+              <w:jc w:val="left"/>
+            </w:pPr>
             <w:r>
               <w:rPr>
+                <w:rFonts w:ascii="Arial" w:hAnsi="Arial"/>
                 <w:b/>
+                <w:sz w:val="20"/>
               </w:rPr>
               <w:t>EC2</w:t>
             </w:r>
@@ -416,9 +530,14 @@
             <w:tcW w:type="dxa" w:w="2160"/>
           </w:tcPr>
           <w:p>
+            <w:pPr>
+              <w:jc w:val="left"/>
+            </w:pPr>
             <w:r>
               <w:rPr>
+                <w:rFonts w:ascii="Arial" w:hAnsi="Arial"/>
                 <w:b/>
+                <w:sz w:val="20"/>
               </w:rPr>
               <w:t>Función</w:t>
             </w:r>
@@ -429,9 +548,14 @@
             <w:tcW w:type="dxa" w:w="2160"/>
           </w:tcPr>
           <w:p>
+            <w:pPr>
+              <w:jc w:val="left"/>
+            </w:pPr>
             <w:r>
               <w:rPr>
+                <w:rFonts w:ascii="Arial" w:hAnsi="Arial"/>
                 <w:b/>
+                <w:sz w:val="20"/>
               </w:rPr>
               <w:t>Servicios / Puertos</w:t>
             </w:r>
@@ -444,7 +568,14 @@
             <w:tcW w:type="dxa" w:w="2160"/>
           </w:tcPr>
           <w:p>
+            <w:pPr>
+              <w:jc w:val="left"/>
+            </w:pPr>
             <w:r>
+              <w:rPr>
+                <w:rFonts w:ascii="Arial" w:hAnsi="Arial"/>
+                <w:sz w:val="20"/>
+              </w:rPr>
               <w:t>MongoDB</w:t>
             </w:r>
           </w:p>
@@ -454,7 +585,14 @@
             <w:tcW w:type="dxa" w:w="2160"/>
           </w:tcPr>
           <w:p>
+            <w:pPr>
+              <w:jc w:val="left"/>
+            </w:pPr>
             <w:r>
+              <w:rPr>
+                <w:rFonts w:ascii="Arial" w:hAnsi="Arial"/>
+                <w:sz w:val="20"/>
+              </w:rPr>
               <w:t>EC2-1</w:t>
             </w:r>
           </w:p>
@@ -464,7 +602,14 @@
             <w:tcW w:type="dxa" w:w="2160"/>
           </w:tcPr>
           <w:p>
+            <w:pPr>
+              <w:jc w:val="left"/>
+            </w:pPr>
             <w:r>
+              <w:rPr>
+                <w:rFonts w:ascii="Arial" w:hAnsi="Arial"/>
+                <w:sz w:val="20"/>
+              </w:rPr>
               <w:t>BD + Exporters</w:t>
             </w:r>
           </w:p>
@@ -474,7 +619,14 @@
             <w:tcW w:type="dxa" w:w="2160"/>
           </w:tcPr>
           <w:p>
+            <w:pPr>
+              <w:jc w:val="left"/>
+            </w:pPr>
             <w:r>
+              <w:rPr>
+                <w:rFonts w:ascii="Arial" w:hAnsi="Arial"/>
+                <w:sz w:val="20"/>
+              </w:rPr>
               <w:t>MongoDB 7 + MongoDB Exporter + Node Exporter</w:t>
               <w:br/>
               <w:t>27017, 30092, 9100</w:t>
@@ -488,7 +640,14 @@
             <w:tcW w:type="dxa" w:w="2160"/>
           </w:tcPr>
           <w:p>
+            <w:pPr>
+              <w:jc w:val="left"/>
+            </w:pPr>
             <w:r>
+              <w:rPr>
+                <w:rFonts w:ascii="Arial" w:hAnsi="Arial"/>
+                <w:sz w:val="20"/>
+              </w:rPr>
               <w:t>Backend</w:t>
             </w:r>
           </w:p>
@@ -498,7 +657,14 @@
             <w:tcW w:type="dxa" w:w="2160"/>
           </w:tcPr>
           <w:p>
+            <w:pPr>
+              <w:jc w:val="left"/>
+            </w:pPr>
             <w:r>
+              <w:rPr>
+                <w:rFonts w:ascii="Arial" w:hAnsi="Arial"/>
+                <w:sz w:val="20"/>
+              </w:rPr>
               <w:t>EC2-2</w:t>
             </w:r>
           </w:p>
@@ -508,7 +674,14 @@
             <w:tcW w:type="dxa" w:w="2160"/>
           </w:tcPr>
           <w:p>
+            <w:pPr>
+              <w:jc w:val="left"/>
+            </w:pPr>
             <w:r>
+              <w:rPr>
+                <w:rFonts w:ascii="Arial" w:hAnsi="Arial"/>
+                <w:sz w:val="20"/>
+              </w:rPr>
               <w:t>API + Métricas</w:t>
             </w:r>
           </w:p>
@@ -518,7 +691,14 @@
             <w:tcW w:type="dxa" w:w="2160"/>
           </w:tcPr>
           <w:p>
+            <w:pPr>
+              <w:jc w:val="left"/>
+            </w:pPr>
             <w:r>
+              <w:rPr>
+                <w:rFonts w:ascii="Arial" w:hAnsi="Arial"/>
+                <w:sz w:val="20"/>
+              </w:rPr>
               <w:t>Spring Boot + Actuator/Micrometer + Node Exporter</w:t>
               <w:br/>
               <w:t>30001, 9100</w:t>
@@ -532,7 +712,14 @@
             <w:tcW w:type="dxa" w:w="2160"/>
           </w:tcPr>
           <w:p>
+            <w:pPr>
+              <w:jc w:val="left"/>
+            </w:pPr>
             <w:r>
+              <w:rPr>
+                <w:rFonts w:ascii="Arial" w:hAnsi="Arial"/>
+                <w:sz w:val="20"/>
+              </w:rPr>
               <w:t>Frontend</w:t>
             </w:r>
           </w:p>
@@ -542,7 +729,14 @@
             <w:tcW w:type="dxa" w:w="2160"/>
           </w:tcPr>
           <w:p>
+            <w:pPr>
+              <w:jc w:val="left"/>
+            </w:pPr>
             <w:r>
+              <w:rPr>
+                <w:rFonts w:ascii="Arial" w:hAnsi="Arial"/>
+                <w:sz w:val="20"/>
+              </w:rPr>
               <w:t>EC2-3</w:t>
             </w:r>
           </w:p>
@@ -552,7 +746,14 @@
             <w:tcW w:type="dxa" w:w="2160"/>
           </w:tcPr>
           <w:p>
+            <w:pPr>
+              <w:jc w:val="left"/>
+            </w:pPr>
             <w:r>
+              <w:rPr>
+                <w:rFonts w:ascii="Arial" w:hAnsi="Arial"/>
+                <w:sz w:val="20"/>
+              </w:rPr>
               <w:t>Frontend + Métricas</w:t>
             </w:r>
           </w:p>
@@ -562,7 +763,14 @@
             <w:tcW w:type="dxa" w:w="2160"/>
           </w:tcPr>
           <w:p>
+            <w:pPr>
+              <w:jc w:val="left"/>
+            </w:pPr>
             <w:r>
+              <w:rPr>
+                <w:rFonts w:ascii="Arial" w:hAnsi="Arial"/>
+                <w:sz w:val="20"/>
+              </w:rPr>
               <w:t>React + Nginx + Node Exporter</w:t>
               <w:br/>
               <w:t>30080, 9100</w:t>
@@ -576,7 +784,14 @@
             <w:tcW w:type="dxa" w:w="2160"/>
           </w:tcPr>
           <w:p>
+            <w:pPr>
+              <w:jc w:val="left"/>
+            </w:pPr>
             <w:r>
+              <w:rPr>
+                <w:rFonts w:ascii="Arial" w:hAnsi="Arial"/>
+                <w:sz w:val="20"/>
+              </w:rPr>
               <w:t>Monitoreo</w:t>
             </w:r>
           </w:p>
@@ -586,7 +801,14 @@
             <w:tcW w:type="dxa" w:w="2160"/>
           </w:tcPr>
           <w:p>
+            <w:pPr>
+              <w:jc w:val="left"/>
+            </w:pPr>
             <w:r>
+              <w:rPr>
+                <w:rFonts w:ascii="Arial" w:hAnsi="Arial"/>
+                <w:sz w:val="20"/>
+              </w:rPr>
               <w:t>EC2-4</w:t>
             </w:r>
           </w:p>
@@ -596,7 +818,14 @@
             <w:tcW w:type="dxa" w:w="2160"/>
           </w:tcPr>
           <w:p>
+            <w:pPr>
+              <w:jc w:val="left"/>
+            </w:pPr>
             <w:r>
+              <w:rPr>
+                <w:rFonts w:ascii="Arial" w:hAnsi="Arial"/>
+                <w:sz w:val="20"/>
+              </w:rPr>
               <w:t>Observabilidad</w:t>
             </w:r>
           </w:p>
@@ -606,7 +835,14 @@
             <w:tcW w:type="dxa" w:w="2160"/>
           </w:tcPr>
           <w:p>
+            <w:pPr>
+              <w:jc w:val="left"/>
+            </w:pPr>
             <w:r>
+              <w:rPr>
+                <w:rFonts w:ascii="Arial" w:hAnsi="Arial"/>
+                <w:sz w:val="20"/>
+              </w:rPr>
               <w:t>Prometheus + Grafana (Minikube)</w:t>
               <w:br/>
               <w:t>30090, 30300</w:t>
@@ -878,9 +1114,14 @@
             <w:tcW w:type="dxa" w:w="2880"/>
           </w:tcPr>
           <w:p>
+            <w:pPr>
+              <w:jc w:val="left"/>
+            </w:pPr>
             <w:r>
               <w:rPr>
+                <w:rFonts w:ascii="Arial" w:hAnsi="Arial"/>
                 <w:b/>
+                <w:sz w:val="20"/>
               </w:rPr>
               <w:t>Recurso</w:t>
             </w:r>
@@ -891,9 +1132,14 @@
             <w:tcW w:type="dxa" w:w="2880"/>
           </w:tcPr>
           <w:p>
+            <w:pPr>
+              <w:jc w:val="left"/>
+            </w:pPr>
             <w:r>
               <w:rPr>
+                <w:rFonts w:ascii="Arial" w:hAnsi="Arial"/>
                 <w:b/>
+                <w:sz w:val="20"/>
               </w:rPr>
               <w:t>Mínimo</w:t>
             </w:r>
@@ -904,9 +1150,14 @@
             <w:tcW w:type="dxa" w:w="2880"/>
           </w:tcPr>
           <w:p>
+            <w:pPr>
+              <w:jc w:val="left"/>
+            </w:pPr>
             <w:r>
               <w:rPr>
+                <w:rFonts w:ascii="Arial" w:hAnsi="Arial"/>
                 <w:b/>
+                <w:sz w:val="20"/>
               </w:rPr>
               <w:t>Justificación</w:t>
             </w:r>
@@ -919,7 +1170,14 @@
             <w:tcW w:type="dxa" w:w="2880"/>
           </w:tcPr>
           <w:p>
+            <w:pPr>
+              <w:jc w:val="left"/>
+            </w:pPr>
             <w:r>
+              <w:rPr>
+                <w:rFonts w:ascii="Arial" w:hAnsi="Arial"/>
+                <w:sz w:val="20"/>
+              </w:rPr>
               <w:t>CPU</w:t>
             </w:r>
           </w:p>
@@ -929,7 +1187,14 @@
             <w:tcW w:type="dxa" w:w="2880"/>
           </w:tcPr>
           <w:p>
+            <w:pPr>
+              <w:jc w:val="left"/>
+            </w:pPr>
             <w:r>
+              <w:rPr>
+                <w:rFonts w:ascii="Arial" w:hAnsi="Arial"/>
+                <w:sz w:val="20"/>
+              </w:rPr>
               <w:t>2 vCPUs</w:t>
             </w:r>
           </w:p>
@@ -939,7 +1204,14 @@
             <w:tcW w:type="dxa" w:w="2880"/>
           </w:tcPr>
           <w:p>
+            <w:pPr>
+              <w:jc w:val="left"/>
+            </w:pPr>
             <w:r>
+              <w:rPr>
+                <w:rFonts w:ascii="Arial" w:hAnsi="Arial"/>
+                <w:sz w:val="20"/>
+              </w:rPr>
               <w:t>Prometheus procesa consultas y scrapea datos cada 15s</w:t>
             </w:r>
           </w:p>
@@ -951,7 +1223,14 @@
             <w:tcW w:type="dxa" w:w="2880"/>
           </w:tcPr>
           <w:p>
+            <w:pPr>
+              <w:jc w:val="left"/>
+            </w:pPr>
             <w:r>
+              <w:rPr>
+                <w:rFonts w:ascii="Arial" w:hAnsi="Arial"/>
+                <w:sz w:val="20"/>
+              </w:rPr>
               <w:t>RAM</w:t>
             </w:r>
           </w:p>
@@ -961,7 +1240,14 @@
             <w:tcW w:type="dxa" w:w="2880"/>
           </w:tcPr>
           <w:p>
+            <w:pPr>
+              <w:jc w:val="left"/>
+            </w:pPr>
             <w:r>
+              <w:rPr>
+                <w:rFonts w:ascii="Arial" w:hAnsi="Arial"/>
+                <w:sz w:val="20"/>
+              </w:rPr>
               <w:t>2 GB</w:t>
             </w:r>
           </w:p>
@@ -971,7 +1257,14 @@
             <w:tcW w:type="dxa" w:w="2880"/>
           </w:tcPr>
           <w:p>
+            <w:pPr>
+              <w:jc w:val="left"/>
+            </w:pPr>
             <w:r>
+              <w:rPr>
+                <w:rFonts w:ascii="Arial" w:hAnsi="Arial"/>
+                <w:sz w:val="20"/>
+              </w:rPr>
               <w:t>Suficiente para Prometheus + Grafana + Minikube</w:t>
             </w:r>
           </w:p>
@@ -983,7 +1276,14 @@
             <w:tcW w:type="dxa" w:w="2880"/>
           </w:tcPr>
           <w:p>
+            <w:pPr>
+              <w:jc w:val="left"/>
+            </w:pPr>
             <w:r>
+              <w:rPr>
+                <w:rFonts w:ascii="Arial" w:hAnsi="Arial"/>
+                <w:sz w:val="20"/>
+              </w:rPr>
               <w:t>Disco</w:t>
             </w:r>
           </w:p>
@@ -993,7 +1293,14 @@
             <w:tcW w:type="dxa" w:w="2880"/>
           </w:tcPr>
           <w:p>
+            <w:pPr>
+              <w:jc w:val="left"/>
+            </w:pPr>
             <w:r>
+              <w:rPr>
+                <w:rFonts w:ascii="Arial" w:hAnsi="Arial"/>
+                <w:sz w:val="20"/>
+              </w:rPr>
               <w:t>20 GB</w:t>
             </w:r>
           </w:p>
@@ -1003,7 +1310,14 @@
             <w:tcW w:type="dxa" w:w="2880"/>
           </w:tcPr>
           <w:p>
+            <w:pPr>
+              <w:jc w:val="left"/>
+            </w:pPr>
             <w:r>
+              <w:rPr>
+                <w:rFonts w:ascii="Arial" w:hAnsi="Arial"/>
+                <w:sz w:val="20"/>
+              </w:rPr>
               <w:t>Almacenamiento de métricas (retención default 15 días)</w:t>
             </w:r>
           </w:p>
@@ -1015,7 +1329,14 @@
             <w:tcW w:type="dxa" w:w="2880"/>
           </w:tcPr>
           <w:p>
+            <w:pPr>
+              <w:jc w:val="left"/>
+            </w:pPr>
             <w:r>
+              <w:rPr>
+                <w:rFonts w:ascii="Arial" w:hAnsi="Arial"/>
+                <w:sz w:val="20"/>
+              </w:rPr>
               <w:t>SO</w:t>
             </w:r>
           </w:p>
@@ -1025,7 +1346,14 @@
             <w:tcW w:type="dxa" w:w="2880"/>
           </w:tcPr>
           <w:p>
+            <w:pPr>
+              <w:jc w:val="left"/>
+            </w:pPr>
             <w:r>
+              <w:rPr>
+                <w:rFonts w:ascii="Arial" w:hAnsi="Arial"/>
+                <w:sz w:val="20"/>
+              </w:rPr>
               <w:t>Ubuntu 24.04</w:t>
             </w:r>
           </w:p>
@@ -1035,7 +1363,14 @@
             <w:tcW w:type="dxa" w:w="2880"/>
           </w:tcPr>
           <w:p>
+            <w:pPr>
+              <w:jc w:val="left"/>
+            </w:pPr>
             <w:r>
+              <w:rPr>
+                <w:rFonts w:ascii="Arial" w:hAnsi="Arial"/>
+                <w:sz w:val="20"/>
+              </w:rPr>
               <w:t>Compatibilidad con el resto del proyecto</w:t>
             </w:r>
           </w:p>
@@ -1047,7 +1382,14 @@
             <w:tcW w:type="dxa" w:w="2880"/>
           </w:tcPr>
           <w:p>
+            <w:pPr>
+              <w:jc w:val="left"/>
+            </w:pPr>
             <w:r>
+              <w:rPr>
+                <w:rFonts w:ascii="Arial" w:hAnsi="Arial"/>
+                <w:sz w:val="20"/>
+              </w:rPr>
               <w:t>Tipo EC2</w:t>
             </w:r>
           </w:p>
@@ -1057,7 +1399,14 @@
             <w:tcW w:type="dxa" w:w="2880"/>
           </w:tcPr>
           <w:p>
+            <w:pPr>
+              <w:jc w:val="left"/>
+            </w:pPr>
             <w:r>
+              <w:rPr>
+                <w:rFonts w:ascii="Arial" w:hAnsi="Arial"/>
+                <w:sz w:val="20"/>
+              </w:rPr>
               <w:t>t3.small</w:t>
             </w:r>
           </w:p>
@@ -1067,7 +1416,14 @@
             <w:tcW w:type="dxa" w:w="2880"/>
           </w:tcPr>
           <w:p>
+            <w:pPr>
+              <w:jc w:val="left"/>
+            </w:pPr>
             <w:r>
+              <w:rPr>
+                <w:rFonts w:ascii="Arial" w:hAnsi="Arial"/>
+                <w:sz w:val="20"/>
+              </w:rPr>
               <w:t>Cumple con los requisitos mínimos</w:t>
             </w:r>
           </w:p>
@@ -1150,9 +1506,14 @@
             <w:tcW w:type="dxa" w:w="2880"/>
           </w:tcPr>
           <w:p>
+            <w:pPr>
+              <w:jc w:val="left"/>
+            </w:pPr>
             <w:r>
               <w:rPr>
+                <w:rFonts w:ascii="Arial" w:hAnsi="Arial"/>
                 <w:b/>
+                <w:sz w:val="20"/>
               </w:rPr>
               <w:t>Servidor</w:t>
             </w:r>
@@ -1163,9 +1524,14 @@
             <w:tcW w:type="dxa" w:w="2880"/>
           </w:tcPr>
           <w:p>
+            <w:pPr>
+              <w:jc w:val="left"/>
+            </w:pPr>
             <w:r>
               <w:rPr>
+                <w:rFonts w:ascii="Arial" w:hAnsi="Arial"/>
                 <w:b/>
+                <w:sz w:val="20"/>
               </w:rPr>
               <w:t>Puertos Abiertos</w:t>
             </w:r>
@@ -1176,9 +1542,14 @@
             <w:tcW w:type="dxa" w:w="2880"/>
           </w:tcPr>
           <w:p>
+            <w:pPr>
+              <w:jc w:val="left"/>
+            </w:pPr>
             <w:r>
               <w:rPr>
+                <w:rFonts w:ascii="Arial" w:hAnsi="Arial"/>
                 <w:b/>
+                <w:sz w:val="20"/>
               </w:rPr>
               <w:t>Origen</w:t>
             </w:r>
@@ -1191,7 +1562,14 @@
             <w:tcW w:type="dxa" w:w="2880"/>
           </w:tcPr>
           <w:p>
+            <w:pPr>
+              <w:jc w:val="left"/>
+            </w:pPr>
             <w:r>
+              <w:rPr>
+                <w:rFonts w:ascii="Arial" w:hAnsi="Arial"/>
+                <w:sz w:val="20"/>
+              </w:rPr>
               <w:t>EC2-1 (MongoDB)</w:t>
             </w:r>
           </w:p>
@@ -1201,7 +1579,14 @@
             <w:tcW w:type="dxa" w:w="2880"/>
           </w:tcPr>
           <w:p>
+            <w:pPr>
+              <w:jc w:val="left"/>
+            </w:pPr>
             <w:r>
+              <w:rPr>
+                <w:rFonts w:ascii="Arial" w:hAnsi="Arial"/>
+                <w:sz w:val="20"/>
+              </w:rPr>
               <w:t>27017, 30092, 9100</w:t>
             </w:r>
           </w:p>
@@ -1211,7 +1596,14 @@
             <w:tcW w:type="dxa" w:w="2880"/>
           </w:tcPr>
           <w:p>
+            <w:pPr>
+              <w:jc w:val="left"/>
+            </w:pPr>
             <w:r>
+              <w:rPr>
+                <w:rFonts w:ascii="Arial" w:hAnsi="Arial"/>
+                <w:sz w:val="20"/>
+              </w:rPr>
               <w:t>EC2-2, EC2-4</w:t>
             </w:r>
           </w:p>
@@ -1223,7 +1615,14 @@
             <w:tcW w:type="dxa" w:w="2880"/>
           </w:tcPr>
           <w:p>
+            <w:pPr>
+              <w:jc w:val="left"/>
+            </w:pPr>
             <w:r>
+              <w:rPr>
+                <w:rFonts w:ascii="Arial" w:hAnsi="Arial"/>
+                <w:sz w:val="20"/>
+              </w:rPr>
               <w:t>EC2-2 (Backend)</w:t>
             </w:r>
           </w:p>
@@ -1233,7 +1632,14 @@
             <w:tcW w:type="dxa" w:w="2880"/>
           </w:tcPr>
           <w:p>
+            <w:pPr>
+              <w:jc w:val="left"/>
+            </w:pPr>
             <w:r>
+              <w:rPr>
+                <w:rFonts w:ascii="Arial" w:hAnsi="Arial"/>
+                <w:sz w:val="20"/>
+              </w:rPr>
               <w:t>30001, 9100</w:t>
             </w:r>
           </w:p>
@@ -1243,7 +1649,14 @@
             <w:tcW w:type="dxa" w:w="2880"/>
           </w:tcPr>
           <w:p>
+            <w:pPr>
+              <w:jc w:val="left"/>
+            </w:pPr>
             <w:r>
+              <w:rPr>
+                <w:rFonts w:ascii="Arial" w:hAnsi="Arial"/>
+                <w:sz w:val="20"/>
+              </w:rPr>
               <w:t>0.0.0.0 (30001), EC2-4 (9100)</w:t>
             </w:r>
           </w:p>
@@ -1255,7 +1668,14 @@
             <w:tcW w:type="dxa" w:w="2880"/>
           </w:tcPr>
           <w:p>
+            <w:pPr>
+              <w:jc w:val="left"/>
+            </w:pPr>
             <w:r>
+              <w:rPr>
+                <w:rFonts w:ascii="Arial" w:hAnsi="Arial"/>
+                <w:sz w:val="20"/>
+              </w:rPr>
               <w:t>EC2-3 (Frontend)</w:t>
             </w:r>
           </w:p>
@@ -1265,7 +1685,14 @@
             <w:tcW w:type="dxa" w:w="2880"/>
           </w:tcPr>
           <w:p>
+            <w:pPr>
+              <w:jc w:val="left"/>
+            </w:pPr>
             <w:r>
+              <w:rPr>
+                <w:rFonts w:ascii="Arial" w:hAnsi="Arial"/>
+                <w:sz w:val="20"/>
+              </w:rPr>
               <w:t>30080, 9100</w:t>
             </w:r>
           </w:p>
@@ -1275,7 +1702,14 @@
             <w:tcW w:type="dxa" w:w="2880"/>
           </w:tcPr>
           <w:p>
+            <w:pPr>
+              <w:jc w:val="left"/>
+            </w:pPr>
             <w:r>
+              <w:rPr>
+                <w:rFonts w:ascii="Arial" w:hAnsi="Arial"/>
+                <w:sz w:val="20"/>
+              </w:rPr>
               <w:t>0.0.0.0 (30080), EC2-4 (9100)</w:t>
             </w:r>
           </w:p>
@@ -1287,7 +1721,14 @@
             <w:tcW w:type="dxa" w:w="2880"/>
           </w:tcPr>
           <w:p>
+            <w:pPr>
+              <w:jc w:val="left"/>
+            </w:pPr>
             <w:r>
+              <w:rPr>
+                <w:rFonts w:ascii="Arial" w:hAnsi="Arial"/>
+                <w:sz w:val="20"/>
+              </w:rPr>
               <w:t>EC2-4 (Monitoreo)</w:t>
             </w:r>
           </w:p>
@@ -1297,7 +1738,14 @@
             <w:tcW w:type="dxa" w:w="2880"/>
           </w:tcPr>
           <w:p>
+            <w:pPr>
+              <w:jc w:val="left"/>
+            </w:pPr>
             <w:r>
+              <w:rPr>
+                <w:rFonts w:ascii="Arial" w:hAnsi="Arial"/>
+                <w:sz w:val="20"/>
+              </w:rPr>
               <w:t>30090, 30300</w:t>
             </w:r>
           </w:p>
@@ -1307,7 +1755,14 @@
             <w:tcW w:type="dxa" w:w="2880"/>
           </w:tcPr>
           <w:p>
+            <w:pPr>
+              <w:jc w:val="left"/>
+            </w:pPr>
             <w:r>
+              <w:rPr>
+                <w:rFonts w:ascii="Arial" w:hAnsi="Arial"/>
+                <w:sz w:val="20"/>
+              </w:rPr>
               <w:t>0.0.0.0</w:t>
             </w:r>
           </w:p>
@@ -1353,9 +1808,14 @@
             <w:tcW w:type="dxa" w:w="2880"/>
           </w:tcPr>
           <w:p>
+            <w:pPr>
+              <w:jc w:val="left"/>
+            </w:pPr>
             <w:r>
               <w:rPr>
+                <w:rFonts w:ascii="Arial" w:hAnsi="Arial"/>
                 <w:b/>
+                <w:sz w:val="20"/>
               </w:rPr>
               <w:t>Archivo</w:t>
             </w:r>
@@ -1366,9 +1826,14 @@
             <w:tcW w:type="dxa" w:w="2880"/>
           </w:tcPr>
           <w:p>
+            <w:pPr>
+              <w:jc w:val="left"/>
+            </w:pPr>
             <w:r>
               <w:rPr>
+                <w:rFonts w:ascii="Arial" w:hAnsi="Arial"/>
                 <w:b/>
+                <w:sz w:val="20"/>
               </w:rPr>
               <w:t>Acción</w:t>
             </w:r>
@@ -1379,9 +1844,14 @@
             <w:tcW w:type="dxa" w:w="2880"/>
           </w:tcPr>
           <w:p>
+            <w:pPr>
+              <w:jc w:val="left"/>
+            </w:pPr>
             <w:r>
               <w:rPr>
+                <w:rFonts w:ascii="Arial" w:hAnsi="Arial"/>
                 <w:b/>
+                <w:sz w:val="20"/>
               </w:rPr>
               <w:t>Descripción</w:t>
             </w:r>
@@ -1394,7 +1864,14 @@
             <w:tcW w:type="dxa" w:w="2880"/>
           </w:tcPr>
           <w:p>
+            <w:pPr>
+              <w:jc w:val="left"/>
+            </w:pPr>
             <w:r>
+              <w:rPr>
+                <w:rFonts w:ascii="Arial" w:hAnsi="Arial"/>
+                <w:sz w:val="20"/>
+              </w:rPr>
               <w:t>backend-cluster/backend-deployment.yaml</w:t>
             </w:r>
           </w:p>
@@ -1404,7 +1881,14 @@
             <w:tcW w:type="dxa" w:w="2880"/>
           </w:tcPr>
           <w:p>
+            <w:pPr>
+              <w:jc w:val="left"/>
+            </w:pPr>
             <w:r>
+              <w:rPr>
+                <w:rFonts w:ascii="Arial" w:hAnsi="Arial"/>
+                <w:sz w:val="20"/>
+              </w:rPr>
               <w:t>Modificado</w:t>
             </w:r>
           </w:p>
@@ -1414,7 +1898,14 @@
             <w:tcW w:type="dxa" w:w="2880"/>
           </w:tcPr>
           <w:p>
+            <w:pPr>
+              <w:jc w:val="left"/>
+            </w:pPr>
             <w:r>
+              <w:rPr>
+                <w:rFonts w:ascii="Arial" w:hAnsi="Arial"/>
+                <w:sz w:val="20"/>
+              </w:rPr>
               <w:t>Image tag monitoring (con Actuator)</w:t>
             </w:r>
           </w:p>
@@ -1426,7 +1917,14 @@
             <w:tcW w:type="dxa" w:w="2880"/>
           </w:tcPr>
           <w:p>
+            <w:pPr>
+              <w:jc w:val="left"/>
+            </w:pPr>
             <w:r>
+              <w:rPr>
+                <w:rFonts w:ascii="Arial" w:hAnsi="Arial"/>
+                <w:sz w:val="20"/>
+              </w:rPr>
               <w:t>mongo-cluster/mongo-deployment.yaml</w:t>
             </w:r>
           </w:p>
@@ -1436,7 +1934,14 @@
             <w:tcW w:type="dxa" w:w="2880"/>
           </w:tcPr>
           <w:p>
+            <w:pPr>
+              <w:jc w:val="left"/>
+            </w:pPr>
             <w:r>
+              <w:rPr>
+                <w:rFonts w:ascii="Arial" w:hAnsi="Arial"/>
+                <w:sz w:val="20"/>
+              </w:rPr>
               <w:t>Modificado</w:t>
             </w:r>
           </w:p>
@@ -1446,7 +1951,14 @@
             <w:tcW w:type="dxa" w:w="2880"/>
           </w:tcPr>
           <w:p>
+            <w:pPr>
+              <w:jc w:val="left"/>
+            </w:pPr>
             <w:r>
+              <w:rPr>
+                <w:rFonts w:ascii="Arial" w:hAnsi="Arial"/>
+                <w:sz w:val="20"/>
+              </w:rPr>
               <w:t>Sidecar MongoDB Exporter --collect-all --compatible-mode</w:t>
             </w:r>
           </w:p>
@@ -1458,7 +1970,14 @@
             <w:tcW w:type="dxa" w:w="2880"/>
           </w:tcPr>
           <w:p>
+            <w:pPr>
+              <w:jc w:val="left"/>
+            </w:pPr>
             <w:r>
+              <w:rPr>
+                <w:rFonts w:ascii="Arial" w:hAnsi="Arial"/>
+                <w:sz w:val="20"/>
+              </w:rPr>
               <w:t>mongo-cluster/mongodb-exporter-service.yaml</w:t>
             </w:r>
           </w:p>
@@ -1468,7 +1987,14 @@
             <w:tcW w:type="dxa" w:w="2880"/>
           </w:tcPr>
           <w:p>
+            <w:pPr>
+              <w:jc w:val="left"/>
+            </w:pPr>
             <w:r>
+              <w:rPr>
+                <w:rFonts w:ascii="Arial" w:hAnsi="Arial"/>
+                <w:sz w:val="20"/>
+              </w:rPr>
               <w:t>Creado</w:t>
             </w:r>
           </w:p>
@@ -1478,7 +2004,14 @@
             <w:tcW w:type="dxa" w:w="2880"/>
           </w:tcPr>
           <w:p>
+            <w:pPr>
+              <w:jc w:val="left"/>
+            </w:pPr>
             <w:r>
+              <w:rPr>
+                <w:rFonts w:ascii="Arial" w:hAnsi="Arial"/>
+                <w:sz w:val="20"/>
+              </w:rPr>
               <w:t>Service NodePort 30092 para MongoDB Exporter</w:t>
             </w:r>
           </w:p>
@@ -1490,7 +2023,14 @@
             <w:tcW w:type="dxa" w:w="2880"/>
           </w:tcPr>
           <w:p>
+            <w:pPr>
+              <w:jc w:val="left"/>
+            </w:pPr>
             <w:r>
+              <w:rPr>
+                <w:rFonts w:ascii="Arial" w:hAnsi="Arial"/>
+                <w:sz w:val="20"/>
+              </w:rPr>
               <w:t>monitoreo/namespace-monitoreo.yaml</w:t>
             </w:r>
           </w:p>
@@ -1500,7 +2040,14 @@
             <w:tcW w:type="dxa" w:w="2880"/>
           </w:tcPr>
           <w:p>
+            <w:pPr>
+              <w:jc w:val="left"/>
+            </w:pPr>
             <w:r>
+              <w:rPr>
+                <w:rFonts w:ascii="Arial" w:hAnsi="Arial"/>
+                <w:sz w:val="20"/>
+              </w:rPr>
               <w:t>Creado</w:t>
             </w:r>
           </w:p>
@@ -1510,7 +2057,14 @@
             <w:tcW w:type="dxa" w:w="2880"/>
           </w:tcPr>
           <w:p>
+            <w:pPr>
+              <w:jc w:val="left"/>
+            </w:pPr>
             <w:r>
+              <w:rPr>
+                <w:rFonts w:ascii="Arial" w:hAnsi="Arial"/>
+                <w:sz w:val="20"/>
+              </w:rPr>
               <w:t>Namespace monitoreo</w:t>
             </w:r>
           </w:p>
@@ -1522,7 +2076,14 @@
             <w:tcW w:type="dxa" w:w="2880"/>
           </w:tcPr>
           <w:p>
+            <w:pPr>
+              <w:jc w:val="left"/>
+            </w:pPr>
             <w:r>
+              <w:rPr>
+                <w:rFonts w:ascii="Arial" w:hAnsi="Arial"/>
+                <w:sz w:val="20"/>
+              </w:rPr>
               <w:t>monitoreo/prometheus/prometheus-config.yaml</w:t>
             </w:r>
           </w:p>
@@ -1532,7 +2093,14 @@
             <w:tcW w:type="dxa" w:w="2880"/>
           </w:tcPr>
           <w:p>
+            <w:pPr>
+              <w:jc w:val="left"/>
+            </w:pPr>
             <w:r>
+              <w:rPr>
+                <w:rFonts w:ascii="Arial" w:hAnsi="Arial"/>
+                <w:sz w:val="20"/>
+              </w:rPr>
               <w:t>Creado</w:t>
             </w:r>
           </w:p>
@@ -1542,7 +2110,14 @@
             <w:tcW w:type="dxa" w:w="2880"/>
           </w:tcPr>
           <w:p>
+            <w:pPr>
+              <w:jc w:val="left"/>
+            </w:pPr>
             <w:r>
+              <w:rPr>
+                <w:rFonts w:ascii="Arial" w:hAnsi="Arial"/>
+                <w:sz w:val="20"/>
+              </w:rPr>
               <w:t>Config de targets + reglas de alerta</w:t>
             </w:r>
           </w:p>
@@ -1554,7 +2129,14 @@
             <w:tcW w:type="dxa" w:w="2880"/>
           </w:tcPr>
           <w:p>
+            <w:pPr>
+              <w:jc w:val="left"/>
+            </w:pPr>
             <w:r>
+              <w:rPr>
+                <w:rFonts w:ascii="Arial" w:hAnsi="Arial"/>
+                <w:sz w:val="20"/>
+              </w:rPr>
               <w:t>monitoreo/prometheus/prometheus-deployment.yaml</w:t>
             </w:r>
           </w:p>
@@ -1564,7 +2146,14 @@
             <w:tcW w:type="dxa" w:w="2880"/>
           </w:tcPr>
           <w:p>
+            <w:pPr>
+              <w:jc w:val="left"/>
+            </w:pPr>
             <w:r>
+              <w:rPr>
+                <w:rFonts w:ascii="Arial" w:hAnsi="Arial"/>
+                <w:sz w:val="20"/>
+              </w:rPr>
               <w:t>Creado</w:t>
             </w:r>
           </w:p>
@@ -1574,7 +2163,14 @@
             <w:tcW w:type="dxa" w:w="2880"/>
           </w:tcPr>
           <w:p>
+            <w:pPr>
+              <w:jc w:val="left"/>
+            </w:pPr>
             <w:r>
+              <w:rPr>
+                <w:rFonts w:ascii="Arial" w:hAnsi="Arial"/>
+                <w:sz w:val="20"/>
+              </w:rPr>
               <w:t>Deployment de Prometheus</w:t>
             </w:r>
           </w:p>
@@ -1586,7 +2182,14 @@
             <w:tcW w:type="dxa" w:w="2880"/>
           </w:tcPr>
           <w:p>
+            <w:pPr>
+              <w:jc w:val="left"/>
+            </w:pPr>
             <w:r>
+              <w:rPr>
+                <w:rFonts w:ascii="Arial" w:hAnsi="Arial"/>
+                <w:sz w:val="20"/>
+              </w:rPr>
               <w:t>monitoreo/prometheus/prometheus-service.yaml</w:t>
             </w:r>
           </w:p>
@@ -1596,7 +2199,14 @@
             <w:tcW w:type="dxa" w:w="2880"/>
           </w:tcPr>
           <w:p>
+            <w:pPr>
+              <w:jc w:val="left"/>
+            </w:pPr>
             <w:r>
+              <w:rPr>
+                <w:rFonts w:ascii="Arial" w:hAnsi="Arial"/>
+                <w:sz w:val="20"/>
+              </w:rPr>
               <w:t>Creado</w:t>
             </w:r>
           </w:p>
@@ -1606,7 +2216,14 @@
             <w:tcW w:type="dxa" w:w="2880"/>
           </w:tcPr>
           <w:p>
+            <w:pPr>
+              <w:jc w:val="left"/>
+            </w:pPr>
             <w:r>
+              <w:rPr>
+                <w:rFonts w:ascii="Arial" w:hAnsi="Arial"/>
+                <w:sz w:val="20"/>
+              </w:rPr>
               <w:t>Service NodePort 30090</w:t>
             </w:r>
           </w:p>
@@ -1618,7 +2235,14 @@
             <w:tcW w:type="dxa" w:w="2880"/>
           </w:tcPr>
           <w:p>
+            <w:pPr>
+              <w:jc w:val="left"/>
+            </w:pPr>
             <w:r>
+              <w:rPr>
+                <w:rFonts w:ascii="Arial" w:hAnsi="Arial"/>
+                <w:sz w:val="20"/>
+              </w:rPr>
               <w:t>monitoreo/grafana/grafana-datasource.yaml</w:t>
             </w:r>
           </w:p>
@@ -1628,7 +2252,14 @@
             <w:tcW w:type="dxa" w:w="2880"/>
           </w:tcPr>
           <w:p>
+            <w:pPr>
+              <w:jc w:val="left"/>
+            </w:pPr>
             <w:r>
+              <w:rPr>
+                <w:rFonts w:ascii="Arial" w:hAnsi="Arial"/>
+                <w:sz w:val="20"/>
+              </w:rPr>
               <w:t>Creado</w:t>
             </w:r>
           </w:p>
@@ -1638,7 +2269,14 @@
             <w:tcW w:type="dxa" w:w="2880"/>
           </w:tcPr>
           <w:p>
+            <w:pPr>
+              <w:jc w:val="left"/>
+            </w:pPr>
             <w:r>
+              <w:rPr>
+                <w:rFonts w:ascii="Arial" w:hAnsi="Arial"/>
+                <w:sz w:val="20"/>
+              </w:rPr>
               <w:t>Datasource automático Prometheus</w:t>
             </w:r>
           </w:p>
@@ -1650,7 +2288,14 @@
             <w:tcW w:type="dxa" w:w="2880"/>
           </w:tcPr>
           <w:p>
+            <w:pPr>
+              <w:jc w:val="left"/>
+            </w:pPr>
             <w:r>
+              <w:rPr>
+                <w:rFonts w:ascii="Arial" w:hAnsi="Arial"/>
+                <w:sz w:val="20"/>
+              </w:rPr>
               <w:t>monitoreo/grafana/grafana-dashboard-configmap.yaml</w:t>
             </w:r>
           </w:p>
@@ -1660,7 +2305,14 @@
             <w:tcW w:type="dxa" w:w="2880"/>
           </w:tcPr>
           <w:p>
+            <w:pPr>
+              <w:jc w:val="left"/>
+            </w:pPr>
             <w:r>
+              <w:rPr>
+                <w:rFonts w:ascii="Arial" w:hAnsi="Arial"/>
+                <w:sz w:val="20"/>
+              </w:rPr>
               <w:t>Creado</w:t>
             </w:r>
           </w:p>
@@ -1670,7 +2322,14 @@
             <w:tcW w:type="dxa" w:w="2880"/>
           </w:tcPr>
           <w:p>
+            <w:pPr>
+              <w:jc w:val="left"/>
+            </w:pPr>
             <w:r>
+              <w:rPr>
+                <w:rFonts w:ascii="Arial" w:hAnsi="Arial"/>
+                <w:sz w:val="20"/>
+              </w:rPr>
               <w:t>Dashboard JSON (6 filas de paneles)</w:t>
             </w:r>
           </w:p>
@@ -1682,7 +2341,14 @@
             <w:tcW w:type="dxa" w:w="2880"/>
           </w:tcPr>
           <w:p>
+            <w:pPr>
+              <w:jc w:val="left"/>
+            </w:pPr>
             <w:r>
+              <w:rPr>
+                <w:rFonts w:ascii="Arial" w:hAnsi="Arial"/>
+                <w:sz w:val="20"/>
+              </w:rPr>
               <w:t>monitoreo/grafana/grafana-deployment.yaml</w:t>
             </w:r>
           </w:p>
@@ -1692,7 +2358,14 @@
             <w:tcW w:type="dxa" w:w="2880"/>
           </w:tcPr>
           <w:p>
+            <w:pPr>
+              <w:jc w:val="left"/>
+            </w:pPr>
             <w:r>
+              <w:rPr>
+                <w:rFonts w:ascii="Arial" w:hAnsi="Arial"/>
+                <w:sz w:val="20"/>
+              </w:rPr>
               <w:t>Creado</w:t>
             </w:r>
           </w:p>
@@ -1702,7 +2375,14 @@
             <w:tcW w:type="dxa" w:w="2880"/>
           </w:tcPr>
           <w:p>
+            <w:pPr>
+              <w:jc w:val="left"/>
+            </w:pPr>
             <w:r>
+              <w:rPr>
+                <w:rFonts w:ascii="Arial" w:hAnsi="Arial"/>
+                <w:sz w:val="20"/>
+              </w:rPr>
               <w:t>Deployment de Grafana</w:t>
             </w:r>
           </w:p>
@@ -1714,7 +2394,14 @@
             <w:tcW w:type="dxa" w:w="2880"/>
           </w:tcPr>
           <w:p>
+            <w:pPr>
+              <w:jc w:val="left"/>
+            </w:pPr>
             <w:r>
+              <w:rPr>
+                <w:rFonts w:ascii="Arial" w:hAnsi="Arial"/>
+                <w:sz w:val="20"/>
+              </w:rPr>
               <w:t>monitoreo/grafana/grafana-service.yaml</w:t>
             </w:r>
           </w:p>
@@ -1724,7 +2411,14 @@
             <w:tcW w:type="dxa" w:w="2880"/>
           </w:tcPr>
           <w:p>
+            <w:pPr>
+              <w:jc w:val="left"/>
+            </w:pPr>
             <w:r>
+              <w:rPr>
+                <w:rFonts w:ascii="Arial" w:hAnsi="Arial"/>
+                <w:sz w:val="20"/>
+              </w:rPr>
               <w:t>Creado</w:t>
             </w:r>
           </w:p>
@@ -1734,7 +2428,14 @@
             <w:tcW w:type="dxa" w:w="2880"/>
           </w:tcPr>
           <w:p>
+            <w:pPr>
+              <w:jc w:val="left"/>
+            </w:pPr>
             <w:r>
+              <w:rPr>
+                <w:rFonts w:ascii="Arial" w:hAnsi="Arial"/>
+                <w:sz w:val="20"/>
+              </w:rPr>
               <w:t>Service NodePort 30300</w:t>
             </w:r>
           </w:p>
@@ -1746,7 +2447,14 @@
             <w:tcW w:type="dxa" w:w="2880"/>
           </w:tcPr>
           <w:p>
+            <w:pPr>
+              <w:jc w:val="left"/>
+            </w:pPr>
             <w:r>
+              <w:rPr>
+                <w:rFonts w:ascii="Arial" w:hAnsi="Arial"/>
+                <w:sz w:val="20"/>
+              </w:rPr>
               <w:t>monitoreo/alertas/alert-rules.yaml</w:t>
             </w:r>
           </w:p>
@@ -1756,7 +2464,14 @@
             <w:tcW w:type="dxa" w:w="2880"/>
           </w:tcPr>
           <w:p>
+            <w:pPr>
+              <w:jc w:val="left"/>
+            </w:pPr>
             <w:r>
+              <w:rPr>
+                <w:rFonts w:ascii="Arial" w:hAnsi="Arial"/>
+                <w:sz w:val="20"/>
+              </w:rPr>
               <w:t>Creado</w:t>
             </w:r>
           </w:p>
@@ -1766,7 +2481,14 @@
             <w:tcW w:type="dxa" w:w="2880"/>
           </w:tcPr>
           <w:p>
+            <w:pPr>
+              <w:jc w:val="left"/>
+            </w:pPr>
             <w:r>
+              <w:rPr>
+                <w:rFonts w:ascii="Arial" w:hAnsi="Arial"/>
+                <w:sz w:val="20"/>
+              </w:rPr>
               <w:t>5 reglas de alerta</w:t>
             </w:r>
           </w:p>
@@ -1778,7 +2500,14 @@
             <w:tcW w:type="dxa" w:w="2880"/>
           </w:tcPr>
           <w:p>
+            <w:pPr>
+              <w:jc w:val="left"/>
+            </w:pPr>
             <w:r>
+              <w:rPr>
+                <w:rFonts w:ascii="Arial" w:hAnsi="Arial"/>
+                <w:sz w:val="20"/>
+              </w:rPr>
               <w:t>comandos.md</w:t>
             </w:r>
           </w:p>
@@ -1788,7 +2517,14 @@
             <w:tcW w:type="dxa" w:w="2880"/>
           </w:tcPr>
           <w:p>
+            <w:pPr>
+              <w:jc w:val="left"/>
+            </w:pPr>
             <w:r>
+              <w:rPr>
+                <w:rFonts w:ascii="Arial" w:hAnsi="Arial"/>
+                <w:sz w:val="20"/>
+              </w:rPr>
               <w:t>Modificado</w:t>
             </w:r>
           </w:p>
@@ -1798,7 +2534,14 @@
             <w:tcW w:type="dxa" w:w="2880"/>
           </w:tcPr>
           <w:p>
+            <w:pPr>
+              <w:jc w:val="left"/>
+            </w:pPr>
             <w:r>
+              <w:rPr>
+                <w:rFonts w:ascii="Arial" w:hAnsi="Arial"/>
+                <w:sz w:val="20"/>
+              </w:rPr>
               <w:t>Guía de despliegue organizada cronológicamente</w:t>
             </w:r>
           </w:p>
@@ -1984,16 +2727,6 @@
       </w:r>
     </w:p>
     <w:p>
-      <w:r>
-        <w:t>[CAPTURA: Manifiesto YAML del sidecar de MongoDB Exporter]</w:t>
-      </w:r>
-    </w:p>
-    <w:p>
-      <w:r>
-        <w:t>[CAPTURA: Pod funcionando con 2/2 containers (mongo + mongodb-exporter)]</w:t>
-      </w:r>
-    </w:p>
-    <w:p>
       <w:pPr>
         <w:pStyle w:val="Heading2"/>
       </w:pPr>
@@ -2044,11 +2777,6 @@
       </w:pPr>
       <w:r>
         <w:t>Se actualizó el backend-deployment.yaml para usar la nueva imagen</w:t>
-      </w:r>
-    </w:p>
-    <w:p>
-      <w:r>
-        <w:t>[CAPTURA: Verificación de métricas del Actuator: curl /actuator/prometheus]</w:t>
       </w:r>
     </w:p>
     <w:p>
@@ -2176,11 +2904,6 @@
       </w:r>
     </w:p>
     <w:p>
-      <w:r>
-        <w:t>[CAPTURA: Archivo de configuración de Prometheus]</w:t>
-      </w:r>
-    </w:p>
-    <w:p>
       <w:pPr>
         <w:pStyle w:val="Heading2"/>
       </w:pPr>
@@ -2242,11 +2965,6 @@
       </w:r>
     </w:p>
     <w:p>
-      <w:r>
-        <w:t>[CAPTURA: Datasource de Prometheus configurado y con estado verde]</w:t>
-      </w:r>
-    </w:p>
-    <w:p>
       <w:pPr>
         <w:pStyle w:val="Heading2"/>
       </w:pPr>
@@ -2277,9 +2995,14 @@
             <w:tcW w:type="dxa" w:w="2880"/>
           </w:tcPr>
           <w:p>
+            <w:pPr>
+              <w:jc w:val="left"/>
+            </w:pPr>
             <w:r>
               <w:rPr>
+                <w:rFonts w:ascii="Arial" w:hAnsi="Arial"/>
                 <w:b/>
+                <w:sz w:val="20"/>
               </w:rPr>
               <w:t>Alerta</w:t>
             </w:r>
@@ -2290,9 +3013,14 @@
             <w:tcW w:type="dxa" w:w="2880"/>
           </w:tcPr>
           <w:p>
+            <w:pPr>
+              <w:jc w:val="left"/>
+            </w:pPr>
             <w:r>
               <w:rPr>
+                <w:rFonts w:ascii="Arial" w:hAnsi="Arial"/>
                 <w:b/>
+                <w:sz w:val="20"/>
               </w:rPr>
               <w:t>Condición</w:t>
             </w:r>
@@ -2303,9 +3031,14 @@
             <w:tcW w:type="dxa" w:w="2880"/>
           </w:tcPr>
           <w:p>
+            <w:pPr>
+              <w:jc w:val="left"/>
+            </w:pPr>
             <w:r>
               <w:rPr>
+                <w:rFonts w:ascii="Arial" w:hAnsi="Arial"/>
                 <w:b/>
+                <w:sz w:val="20"/>
               </w:rPr>
               <w:t>Severidad</w:t>
             </w:r>
@@ -2318,7 +3051,14 @@
             <w:tcW w:type="dxa" w:w="2880"/>
           </w:tcPr>
           <w:p>
+            <w:pPr>
+              <w:jc w:val="left"/>
+            </w:pPr>
             <w:r>
+              <w:rPr>
+                <w:rFonts w:ascii="Arial" w:hAnsi="Arial"/>
+                <w:sz w:val="20"/>
+              </w:rPr>
               <w:t>HighCPUUsage</w:t>
             </w:r>
           </w:p>
@@ -2328,7 +3068,14 @@
             <w:tcW w:type="dxa" w:w="2880"/>
           </w:tcPr>
           <w:p>
+            <w:pPr>
+              <w:jc w:val="left"/>
+            </w:pPr>
             <w:r>
+              <w:rPr>
+                <w:rFonts w:ascii="Arial" w:hAnsi="Arial"/>
+                <w:sz w:val="20"/>
+              </w:rPr>
               <w:t>CPU &gt; 80% por 5 min</w:t>
             </w:r>
           </w:p>
@@ -2338,7 +3085,14 @@
             <w:tcW w:type="dxa" w:w="2880"/>
           </w:tcPr>
           <w:p>
+            <w:pPr>
+              <w:jc w:val="left"/>
+            </w:pPr>
             <w:r>
+              <w:rPr>
+                <w:rFonts w:ascii="Arial" w:hAnsi="Arial"/>
+                <w:sz w:val="20"/>
+              </w:rPr>
               <w:t>Critical</w:t>
             </w:r>
           </w:p>
@@ -2350,7 +3104,14 @@
             <w:tcW w:type="dxa" w:w="2880"/>
           </w:tcPr>
           <w:p>
+            <w:pPr>
+              <w:jc w:val="left"/>
+            </w:pPr>
             <w:r>
+              <w:rPr>
+                <w:rFonts w:ascii="Arial" w:hAnsi="Arial"/>
+                <w:sz w:val="20"/>
+              </w:rPr>
               <w:t>HighMemoryUsage</w:t>
             </w:r>
           </w:p>
@@ -2360,7 +3121,14 @@
             <w:tcW w:type="dxa" w:w="2880"/>
           </w:tcPr>
           <w:p>
+            <w:pPr>
+              <w:jc w:val="left"/>
+            </w:pPr>
             <w:r>
+              <w:rPr>
+                <w:rFonts w:ascii="Arial" w:hAnsi="Arial"/>
+                <w:sz w:val="20"/>
+              </w:rPr>
               <w:t>Memoria &gt; 80% por 5 min</w:t>
             </w:r>
           </w:p>
@@ -2370,7 +3138,14 @@
             <w:tcW w:type="dxa" w:w="2880"/>
           </w:tcPr>
           <w:p>
+            <w:pPr>
+              <w:jc w:val="left"/>
+            </w:pPr>
             <w:r>
+              <w:rPr>
+                <w:rFonts w:ascii="Arial" w:hAnsi="Arial"/>
+                <w:sz w:val="20"/>
+              </w:rPr>
               <w:t>Critical</w:t>
             </w:r>
           </w:p>
@@ -2382,7 +3157,14 @@
             <w:tcW w:type="dxa" w:w="2880"/>
           </w:tcPr>
           <w:p>
+            <w:pPr>
+              <w:jc w:val="left"/>
+            </w:pPr>
             <w:r>
+              <w:rPr>
+                <w:rFonts w:ascii="Arial" w:hAnsi="Arial"/>
+                <w:sz w:val="20"/>
+              </w:rPr>
               <w:t>LowDiskSpace</w:t>
             </w:r>
           </w:p>
@@ -2392,7 +3174,14 @@
             <w:tcW w:type="dxa" w:w="2880"/>
           </w:tcPr>
           <w:p>
+            <w:pPr>
+              <w:jc w:val="left"/>
+            </w:pPr>
             <w:r>
+              <w:rPr>
+                <w:rFonts w:ascii="Arial" w:hAnsi="Arial"/>
+                <w:sz w:val="20"/>
+              </w:rPr>
               <w:t>Disco libre &lt; 20%</w:t>
             </w:r>
           </w:p>
@@ -2402,7 +3191,14 @@
             <w:tcW w:type="dxa" w:w="2880"/>
           </w:tcPr>
           <w:p>
+            <w:pPr>
+              <w:jc w:val="left"/>
+            </w:pPr>
             <w:r>
+              <w:rPr>
+                <w:rFonts w:ascii="Arial" w:hAnsi="Arial"/>
+                <w:sz w:val="20"/>
+              </w:rPr>
               <w:t>Warning</w:t>
             </w:r>
           </w:p>
@@ -2414,7 +3210,14 @@
             <w:tcW w:type="dxa" w:w="2880"/>
           </w:tcPr>
           <w:p>
+            <w:pPr>
+              <w:jc w:val="left"/>
+            </w:pPr>
             <w:r>
+              <w:rPr>
+                <w:rFonts w:ascii="Arial" w:hAnsi="Arial"/>
+                <w:sz w:val="20"/>
+              </w:rPr>
               <w:t>BackendDown</w:t>
             </w:r>
           </w:p>
@@ -2424,7 +3227,14 @@
             <w:tcW w:type="dxa" w:w="2880"/>
           </w:tcPr>
           <w:p>
+            <w:pPr>
+              <w:jc w:val="left"/>
+            </w:pPr>
             <w:r>
+              <w:rPr>
+                <w:rFonts w:ascii="Arial" w:hAnsi="Arial"/>
+                <w:sz w:val="20"/>
+              </w:rPr>
               <w:t>Backend sin respuesta</w:t>
             </w:r>
           </w:p>
@@ -2434,7 +3244,14 @@
             <w:tcW w:type="dxa" w:w="2880"/>
           </w:tcPr>
           <w:p>
+            <w:pPr>
+              <w:jc w:val="left"/>
+            </w:pPr>
             <w:r>
+              <w:rPr>
+                <w:rFonts w:ascii="Arial" w:hAnsi="Arial"/>
+                <w:sz w:val="20"/>
+              </w:rPr>
               <w:t>Critical</w:t>
             </w:r>
           </w:p>
@@ -2446,7 +3263,14 @@
             <w:tcW w:type="dxa" w:w="2880"/>
           </w:tcPr>
           <w:p>
+            <w:pPr>
+              <w:jc w:val="left"/>
+            </w:pPr>
             <w:r>
+              <w:rPr>
+                <w:rFonts w:ascii="Arial" w:hAnsi="Arial"/>
+                <w:sz w:val="20"/>
+              </w:rPr>
               <w:t>MongoDBDown</w:t>
             </w:r>
           </w:p>
@@ -2456,7 +3280,14 @@
             <w:tcW w:type="dxa" w:w="2880"/>
           </w:tcPr>
           <w:p>
+            <w:pPr>
+              <w:jc w:val="left"/>
+            </w:pPr>
             <w:r>
+              <w:rPr>
+                <w:rFonts w:ascii="Arial" w:hAnsi="Arial"/>
+                <w:sz w:val="20"/>
+              </w:rPr>
               <w:t>MongoDB sin respuesta</w:t>
             </w:r>
           </w:p>
@@ -2466,18 +3297,20 @@
             <w:tcW w:type="dxa" w:w="2880"/>
           </w:tcPr>
           <w:p>
+            <w:pPr>
+              <w:jc w:val="left"/>
+            </w:pPr>
             <w:r>
+              <w:rPr>
+                <w:rFonts w:ascii="Arial" w:hAnsi="Arial"/>
+                <w:sz w:val="20"/>
+              </w:rPr>
               <w:t>Critical</w:t>
             </w:r>
           </w:p>
         </w:tc>
       </w:tr>
     </w:tbl>
-    <w:p>
-      <w:r>
-        <w:t>[CAPTURA: Reglas de alerta en Prometheus]</w:t>
-      </w:r>
-    </w:p>
     <w:p>
       <w:pPr>
         <w:pStyle w:val="Heading2"/>
@@ -2505,9 +3338,14 @@
             <w:tcW w:type="dxa" w:w="2160"/>
           </w:tcPr>
           <w:p>
+            <w:pPr>
+              <w:jc w:val="left"/>
+            </w:pPr>
             <w:r>
               <w:rPr>
+                <w:rFonts w:ascii="Arial" w:hAnsi="Arial"/>
                 <w:b/>
+                <w:sz w:val="20"/>
               </w:rPr>
               <w:t>#</w:t>
             </w:r>
@@ -2518,9 +3356,14 @@
             <w:tcW w:type="dxa" w:w="2160"/>
           </w:tcPr>
           <w:p>
+            <w:pPr>
+              <w:jc w:val="left"/>
+            </w:pPr>
             <w:r>
               <w:rPr>
+                <w:rFonts w:ascii="Arial" w:hAnsi="Arial"/>
                 <w:b/>
+                <w:sz w:val="20"/>
               </w:rPr>
               <w:t>Error</w:t>
             </w:r>
@@ -2531,9 +3374,14 @@
             <w:tcW w:type="dxa" w:w="2160"/>
           </w:tcPr>
           <w:p>
+            <w:pPr>
+              <w:jc w:val="left"/>
+            </w:pPr>
             <w:r>
               <w:rPr>
+                <w:rFonts w:ascii="Arial" w:hAnsi="Arial"/>
                 <w:b/>
+                <w:sz w:val="20"/>
               </w:rPr>
               <w:t>Causa</w:t>
             </w:r>
@@ -2544,9 +3392,14 @@
             <w:tcW w:type="dxa" w:w="2160"/>
           </w:tcPr>
           <w:p>
+            <w:pPr>
+              <w:jc w:val="left"/>
+            </w:pPr>
             <w:r>
               <w:rPr>
+                <w:rFonts w:ascii="Arial" w:hAnsi="Arial"/>
                 <w:b/>
+                <w:sz w:val="20"/>
               </w:rPr>
               <w:t>Solución</w:t>
             </w:r>
@@ -2559,7 +3412,14 @@
             <w:tcW w:type="dxa" w:w="2160"/>
           </w:tcPr>
           <w:p>
+            <w:pPr>
+              <w:jc w:val="left"/>
+            </w:pPr>
             <w:r>
+              <w:rPr>
+                <w:rFonts w:ascii="Arial" w:hAnsi="Arial"/>
+                <w:sz w:val="20"/>
+              </w:rPr>
               <w:t>1</w:t>
             </w:r>
           </w:p>
@@ -2569,7 +3429,14 @@
             <w:tcW w:type="dxa" w:w="2160"/>
           </w:tcPr>
           <w:p>
+            <w:pPr>
+              <w:jc w:val="left"/>
+            </w:pPr>
             <w:r>
+              <w:rPr>
+                <w:rFonts w:ascii="Arial" w:hAnsi="Arial"/>
+                <w:sz w:val="20"/>
+              </w:rPr>
               <w:t>404 al descargar Node Exporter</w:t>
             </w:r>
           </w:p>
@@ -2579,7 +3446,14 @@
             <w:tcW w:type="dxa" w:w="2160"/>
           </w:tcPr>
           <w:p>
+            <w:pPr>
+              <w:jc w:val="left"/>
+            </w:pPr>
             <w:r>
+              <w:rPr>
+                <w:rFonts w:ascii="Arial" w:hAnsi="Arial"/>
+                <w:sz w:val="20"/>
+              </w:rPr>
               <w:t>URL /latest/download/ sin versión explícita</w:t>
             </w:r>
           </w:p>
@@ -2589,7 +3463,14 @@
             <w:tcW w:type="dxa" w:w="2160"/>
           </w:tcPr>
           <w:p>
+            <w:pPr>
+              <w:jc w:val="left"/>
+            </w:pPr>
             <w:r>
+              <w:rPr>
+                <w:rFonts w:ascii="Arial" w:hAnsi="Arial"/>
+                <w:sz w:val="20"/>
+              </w:rPr>
               <w:t>Usar URL con versión v1.11.1 explícita</w:t>
             </w:r>
           </w:p>
@@ -2601,7 +3482,14 @@
             <w:tcW w:type="dxa" w:w="2160"/>
           </w:tcPr>
           <w:p>
+            <w:pPr>
+              <w:jc w:val="left"/>
+            </w:pPr>
             <w:r>
+              <w:rPr>
+                <w:rFonts w:ascii="Arial" w:hAnsi="Arial"/>
+                <w:sz w:val="20"/>
+              </w:rPr>
               <w:t>2</w:t>
             </w:r>
           </w:p>
@@ -2611,7 +3499,14 @@
             <w:tcW w:type="dxa" w:w="2160"/>
           </w:tcPr>
           <w:p>
+            <w:pPr>
+              <w:jc w:val="left"/>
+            </w:pPr>
             <w:r>
+              <w:rPr>
+                <w:rFonts w:ascii="Arial" w:hAnsi="Arial"/>
+                <w:sz w:val="20"/>
+              </w:rPr>
               <w:t>Prometheus CrashLoopBackOff</w:t>
             </w:r>
           </w:p>
@@ -2621,7 +3516,14 @@
             <w:tcW w:type="dxa" w:w="2160"/>
           </w:tcPr>
           <w:p>
+            <w:pPr>
+              <w:jc w:val="left"/>
+            </w:pPr>
             <w:r>
+              <w:rPr>
+                <w:rFonts w:ascii="Arial" w:hAnsi="Arial"/>
+                <w:sz w:val="20"/>
+              </w:rPr>
               <w:t>labels mal indentado en prometheus-config.yaml</w:t>
             </w:r>
           </w:p>
@@ -2631,7 +3533,14 @@
             <w:tcW w:type="dxa" w:w="2160"/>
           </w:tcPr>
           <w:p>
+            <w:pPr>
+              <w:jc w:val="left"/>
+            </w:pPr>
             <w:r>
+              <w:rPr>
+                <w:rFonts w:ascii="Arial" w:hAnsi="Arial"/>
+                <w:sz w:val="20"/>
+              </w:rPr>
               <w:t>Eliminar labels de la configuración</w:t>
             </w:r>
           </w:p>
@@ -2643,7 +3552,14 @@
             <w:tcW w:type="dxa" w:w="2160"/>
           </w:tcPr>
           <w:p>
+            <w:pPr>
+              <w:jc w:val="left"/>
+            </w:pPr>
             <w:r>
+              <w:rPr>
+                <w:rFonts w:ascii="Arial" w:hAnsi="Arial"/>
+                <w:sz w:val="20"/>
+              </w:rPr>
               <w:t>3</w:t>
             </w:r>
           </w:p>
@@ -2653,7 +3569,14 @@
             <w:tcW w:type="dxa" w:w="2160"/>
           </w:tcPr>
           <w:p>
+            <w:pPr>
+              <w:jc w:val="left"/>
+            </w:pPr>
             <w:r>
+              <w:rPr>
+                <w:rFonts w:ascii="Arial" w:hAnsi="Arial"/>
+                <w:sz w:val="20"/>
+              </w:rPr>
               <w:t>Target MongoDB DOWN</w:t>
             </w:r>
           </w:p>
@@ -2663,7 +3586,14 @@
             <w:tcW w:type="dxa" w:w="2160"/>
           </w:tcPr>
           <w:p>
+            <w:pPr>
+              <w:jc w:val="left"/>
+            </w:pPr>
             <w:r>
+              <w:rPr>
+                <w:rFonts w:ascii="Arial" w:hAnsi="Arial"/>
+                <w:sz w:val="20"/>
+              </w:rPr>
               <w:t>Falta port-forward para MongoDB Exporter</w:t>
             </w:r>
           </w:p>
@@ -2673,7 +3603,14 @@
             <w:tcW w:type="dxa" w:w="2160"/>
           </w:tcPr>
           <w:p>
+            <w:pPr>
+              <w:jc w:val="left"/>
+            </w:pPr>
             <w:r>
+              <w:rPr>
+                <w:rFonts w:ascii="Arial" w:hAnsi="Arial"/>
+                <w:sz w:val="20"/>
+              </w:rPr>
               <w:t>kubectl port-forward service/mongodb-exporter-service 30092:9216</w:t>
             </w:r>
           </w:p>
@@ -2685,7 +3622,14 @@
             <w:tcW w:type="dxa" w:w="2160"/>
           </w:tcPr>
           <w:p>
+            <w:pPr>
+              <w:jc w:val="left"/>
+            </w:pPr>
             <w:r>
+              <w:rPr>
+                <w:rFonts w:ascii="Arial" w:hAnsi="Arial"/>
+                <w:sz w:val="20"/>
+              </w:rPr>
               <w:t>4</w:t>
             </w:r>
           </w:p>
@@ -2695,7 +3639,14 @@
             <w:tcW w:type="dxa" w:w="2160"/>
           </w:tcPr>
           <w:p>
+            <w:pPr>
+              <w:jc w:val="left"/>
+            </w:pPr>
             <w:r>
+              <w:rPr>
+                <w:rFonts w:ascii="Arial" w:hAnsi="Arial"/>
+                <w:sz w:val="20"/>
+              </w:rPr>
               <w:t>Dashboard MongoDB sin datos</w:t>
             </w:r>
           </w:p>
@@ -2705,7 +3656,14 @@
             <w:tcW w:type="dxa" w:w="2160"/>
           </w:tcPr>
           <w:p>
+            <w:pPr>
+              <w:jc w:val="left"/>
+            </w:pPr>
             <w:r>
+              <w:rPr>
+                <w:rFonts w:ascii="Arial" w:hAnsi="Arial"/>
+                <w:sz w:val="20"/>
+              </w:rPr>
               <w:t>Sin collectors habilitados</w:t>
             </w:r>
           </w:p>
@@ -2715,7 +3673,14 @@
             <w:tcW w:type="dxa" w:w="2160"/>
           </w:tcPr>
           <w:p>
+            <w:pPr>
+              <w:jc w:val="left"/>
+            </w:pPr>
             <w:r>
+              <w:rPr>
+                <w:rFonts w:ascii="Arial" w:hAnsi="Arial"/>
+                <w:sz w:val="20"/>
+              </w:rPr>
               <w:t>Agregar --collect-all --compatible-mode al sidecar</w:t>
             </w:r>
           </w:p>
@@ -2727,7 +3692,14 @@
             <w:tcW w:type="dxa" w:w="2160"/>
           </w:tcPr>
           <w:p>
+            <w:pPr>
+              <w:jc w:val="left"/>
+            </w:pPr>
             <w:r>
+              <w:rPr>
+                <w:rFonts w:ascii="Arial" w:hAnsi="Arial"/>
+                <w:sz w:val="20"/>
+              </w:rPr>
               <w:t>5</w:t>
             </w:r>
           </w:p>
@@ -2737,7 +3709,14 @@
             <w:tcW w:type="dxa" w:w="2160"/>
           </w:tcPr>
           <w:p>
+            <w:pPr>
+              <w:jc w:val="left"/>
+            </w:pPr>
             <w:r>
+              <w:rPr>
+                <w:rFonts w:ascii="Arial" w:hAnsi="Arial"/>
+                <w:sz w:val="20"/>
+              </w:rPr>
               <w:t>Error unknown flag en sidecar</w:t>
             </w:r>
           </w:p>
@@ -2747,7 +3726,14 @@
             <w:tcW w:type="dxa" w:w="2160"/>
           </w:tcPr>
           <w:p>
+            <w:pPr>
+              <w:jc w:val="left"/>
+            </w:pPr>
             <w:r>
+              <w:rPr>
+                <w:rFonts w:ascii="Arial" w:hAnsi="Arial"/>
+                <w:sz w:val="20"/>
+              </w:rPr>
               <w:t>Flags --collector.database no existen</w:t>
             </w:r>
           </w:p>
@@ -2757,7 +3743,14 @@
             <w:tcW w:type="dxa" w:w="2160"/>
           </w:tcPr>
           <w:p>
+            <w:pPr>
+              <w:jc w:val="left"/>
+            </w:pPr>
             <w:r>
+              <w:rPr>
+                <w:rFonts w:ascii="Arial" w:hAnsi="Arial"/>
+                <w:sz w:val="20"/>
+              </w:rPr>
               <w:t>Usar --collect-all en vez de flags individuales</w:t>
             </w:r>
           </w:p>
@@ -2769,7 +3762,14 @@
             <w:tcW w:type="dxa" w:w="2160"/>
           </w:tcPr>
           <w:p>
+            <w:pPr>
+              <w:jc w:val="left"/>
+            </w:pPr>
             <w:r>
+              <w:rPr>
+                <w:rFonts w:ascii="Arial" w:hAnsi="Arial"/>
+                <w:sz w:val="20"/>
+              </w:rPr>
               <w:t>6</w:t>
             </w:r>
           </w:p>
@@ -2779,7 +3779,14 @@
             <w:tcW w:type="dxa" w:w="2160"/>
           </w:tcPr>
           <w:p>
+            <w:pPr>
+              <w:jc w:val="left"/>
+            </w:pPr>
             <w:r>
+              <w:rPr>
+                <w:rFonts w:ascii="Arial" w:hAnsi="Arial"/>
+                <w:sz w:val="20"/>
+              </w:rPr>
               <w:t>Dashboard JVM sin datos</w:t>
             </w:r>
           </w:p>
@@ -2789,7 +3796,14 @@
             <w:tcW w:type="dxa" w:w="2160"/>
           </w:tcPr>
           <w:p>
+            <w:pPr>
+              <w:jc w:val="left"/>
+            </w:pPr>
             <w:r>
+              <w:rPr>
+                <w:rFonts w:ascii="Arial" w:hAnsi="Arial"/>
+                <w:sz w:val="20"/>
+              </w:rPr>
               <w:t>Query jvm_memory_used_bytes con label job incorrecto</w:t>
             </w:r>
           </w:p>
@@ -2799,7 +3813,14 @@
             <w:tcW w:type="dxa" w:w="2160"/>
           </w:tcPr>
           <w:p>
+            <w:pPr>
+              <w:jc w:val="left"/>
+            </w:pPr>
             <w:r>
+              <w:rPr>
+                <w:rFonts w:ascii="Arial" w:hAnsi="Arial"/>
+                <w:sz w:val="20"/>
+              </w:rPr>
               <w:t>Usar jvm_memory_committed_bytes con application="Elchino"</w:t>
             </w:r>
           </w:p>
@@ -2811,7 +3832,14 @@
             <w:tcW w:type="dxa" w:w="2160"/>
           </w:tcPr>
           <w:p>
+            <w:pPr>
+              <w:jc w:val="left"/>
+            </w:pPr>
             <w:r>
+              <w:rPr>
+                <w:rFonts w:ascii="Arial" w:hAnsi="Arial"/>
+                <w:sz w:val="20"/>
+              </w:rPr>
               <w:t>7</w:t>
             </w:r>
           </w:p>
@@ -2821,7 +3849,14 @@
             <w:tcW w:type="dxa" w:w="2160"/>
           </w:tcPr>
           <w:p>
+            <w:pPr>
+              <w:jc w:val="left"/>
+            </w:pPr>
             <w:r>
+              <w:rPr>
+                <w:rFonts w:ascii="Arial" w:hAnsi="Arial"/>
+                <w:sz w:val="20"/>
+              </w:rPr>
               <w:t>P99 sin datos</w:t>
             </w:r>
           </w:p>
@@ -2831,7 +3866,14 @@
             <w:tcW w:type="dxa" w:w="2160"/>
           </w:tcPr>
           <w:p>
+            <w:pPr>
+              <w:jc w:val="left"/>
+            </w:pPr>
             <w:r>
+              <w:rPr>
+                <w:rFonts w:ascii="Arial" w:hAnsi="Arial"/>
+                <w:sz w:val="20"/>
+              </w:rPr>
               <w:t>WebFlux no genera histogram buckets</w:t>
             </w:r>
           </w:p>
@@ -2841,7 +3883,14 @@
             <w:tcW w:type="dxa" w:w="2160"/>
           </w:tcPr>
           <w:p>
+            <w:pPr>
+              <w:jc w:val="left"/>
+            </w:pPr>
             <w:r>
+              <w:rPr>
+                <w:rFonts w:ascii="Arial" w:hAnsi="Arial"/>
+                <w:sz w:val="20"/>
+              </w:rPr>
               <w:t>Cambiar a promedio: rate(sum)/rate(count)*1000</w:t>
             </w:r>
           </w:p>
@@ -2853,7 +3902,14 @@
             <w:tcW w:type="dxa" w:w="2160"/>
           </w:tcPr>
           <w:p>
+            <w:pPr>
+              <w:jc w:val="left"/>
+            </w:pPr>
             <w:r>
+              <w:rPr>
+                <w:rFonts w:ascii="Arial" w:hAnsi="Arial"/>
+                <w:sz w:val="20"/>
+              </w:rPr>
               <w:t>8</w:t>
             </w:r>
           </w:p>
@@ -2863,7 +3919,14 @@
             <w:tcW w:type="dxa" w:w="2160"/>
           </w:tcPr>
           <w:p>
+            <w:pPr>
+              <w:jc w:val="left"/>
+            </w:pPr>
             <w:r>
+              <w:rPr>
+                <w:rFonts w:ascii="Arial" w:hAnsi="Arial"/>
+                <w:sz w:val="20"/>
+              </w:rPr>
               <w:t>git push rechazado</w:t>
             </w:r>
           </w:p>
@@ -2873,7 +3936,14 @@
             <w:tcW w:type="dxa" w:w="2160"/>
           </w:tcPr>
           <w:p>
+            <w:pPr>
+              <w:jc w:val="left"/>
+            </w:pPr>
             <w:r>
+              <w:rPr>
+                <w:rFonts w:ascii="Arial" w:hAnsi="Arial"/>
+                <w:sz w:val="20"/>
+              </w:rPr>
               <w:t>Cambios remotos no sincronizados</w:t>
             </w:r>
           </w:p>
@@ -2883,7 +3953,14 @@
             <w:tcW w:type="dxa" w:w="2160"/>
           </w:tcPr>
           <w:p>
+            <w:pPr>
+              <w:jc w:val="left"/>
+            </w:pPr>
             <w:r>
+              <w:rPr>
+                <w:rFonts w:ascii="Arial" w:hAnsi="Arial"/>
+                <w:sz w:val="20"/>
+              </w:rPr>
               <w:t>git pull origin develop y resolver merge</w:t>
             </w:r>
           </w:p>
@@ -2895,7 +3972,14 @@
             <w:tcW w:type="dxa" w:w="2160"/>
           </w:tcPr>
           <w:p>
+            <w:pPr>
+              <w:jc w:val="left"/>
+            </w:pPr>
             <w:r>
+              <w:rPr>
+                <w:rFonts w:ascii="Arial" w:hAnsi="Arial"/>
+                <w:sz w:val="20"/>
+              </w:rPr>
               <w:t>9</w:t>
             </w:r>
           </w:p>
@@ -2905,7 +3989,14 @@
             <w:tcW w:type="dxa" w:w="2160"/>
           </w:tcPr>
           <w:p>
+            <w:pPr>
+              <w:jc w:val="left"/>
+            </w:pPr>
             <w:r>
+              <w:rPr>
+                <w:rFonts w:ascii="Arial" w:hAnsi="Arial"/>
+                <w:sz w:val="20"/>
+              </w:rPr>
               <w:t>Minikube warning de memoria</w:t>
             </w:r>
           </w:p>
@@ -2915,7 +4006,14 @@
             <w:tcW w:type="dxa" w:w="2160"/>
           </w:tcPr>
           <w:p>
+            <w:pPr>
+              <w:jc w:val="left"/>
+            </w:pPr>
             <w:r>
+              <w:rPr>
+                <w:rFonts w:ascii="Arial" w:hAnsi="Arial"/>
+                <w:sz w:val="20"/>
+              </w:rPr>
               <w:t>t3.small 2GB justo para 3072MB default</w:t>
             </w:r>
           </w:p>
@@ -2925,7 +4023,14 @@
             <w:tcW w:type="dxa" w:w="2160"/>
           </w:tcPr>
           <w:p>
+            <w:pPr>
+              <w:jc w:val="left"/>
+            </w:pPr>
             <w:r>
+              <w:rPr>
+                <w:rFonts w:ascii="Arial" w:hAnsi="Arial"/>
+                <w:sz w:val="20"/>
+              </w:rPr>
               <w:t>Reducir a --memory=2048mb (opcional)</w:t>
             </w:r>
           </w:p>
@@ -2969,9 +4074,14 @@
             <w:tcW w:type="dxa" w:w="2160"/>
           </w:tcPr>
           <w:p>
+            <w:pPr>
+              <w:jc w:val="left"/>
+            </w:pPr>
             <w:r>
               <w:rPr>
+                <w:rFonts w:ascii="Arial" w:hAnsi="Arial"/>
                 <w:b/>
+                <w:sz w:val="20"/>
               </w:rPr>
               <w:t>Fila</w:t>
             </w:r>
@@ -2982,9 +4092,14 @@
             <w:tcW w:type="dxa" w:w="2160"/>
           </w:tcPr>
           <w:p>
+            <w:pPr>
+              <w:jc w:val="left"/>
+            </w:pPr>
             <w:r>
               <w:rPr>
+                <w:rFonts w:ascii="Arial" w:hAnsi="Arial"/>
                 <w:b/>
+                <w:sz w:val="20"/>
               </w:rPr>
               <w:t>Panel</w:t>
             </w:r>
@@ -2995,9 +4110,14 @@
             <w:tcW w:type="dxa" w:w="2160"/>
           </w:tcPr>
           <w:p>
+            <w:pPr>
+              <w:jc w:val="left"/>
+            </w:pPr>
             <w:r>
               <w:rPr>
+                <w:rFonts w:ascii="Arial" w:hAnsi="Arial"/>
                 <w:b/>
+                <w:sz w:val="20"/>
               </w:rPr>
               <w:t>Métrica Utilizada</w:t>
             </w:r>
@@ -3008,9 +4128,14 @@
             <w:tcW w:type="dxa" w:w="2160"/>
           </w:tcPr>
           <w:p>
+            <w:pPr>
+              <w:jc w:val="left"/>
+            </w:pPr>
             <w:r>
               <w:rPr>
+                <w:rFonts w:ascii="Arial" w:hAnsi="Arial"/>
                 <w:b/>
+                <w:sz w:val="20"/>
               </w:rPr>
               <w:t>Tipo</w:t>
             </w:r>
@@ -3023,7 +4148,14 @@
             <w:tcW w:type="dxa" w:w="2160"/>
           </w:tcPr>
           <w:p>
+            <w:pPr>
+              <w:jc w:val="left"/>
+            </w:pPr>
             <w:r>
+              <w:rPr>
+                <w:rFonts w:ascii="Arial" w:hAnsi="Arial"/>
+                <w:sz w:val="20"/>
+              </w:rPr>
               <w:t>1</w:t>
             </w:r>
           </w:p>
@@ -3033,7 +4165,14 @@
             <w:tcW w:type="dxa" w:w="2160"/>
           </w:tcPr>
           <w:p>
+            <w:pPr>
+              <w:jc w:val="left"/>
+            </w:pPr>
             <w:r>
+              <w:rPr>
+                <w:rFonts w:ascii="Arial" w:hAnsi="Arial"/>
+                <w:sz w:val="20"/>
+              </w:rPr>
               <w:t>Estado General de Servidores</w:t>
             </w:r>
           </w:p>
@@ -3043,7 +4182,14 @@
             <w:tcW w:type="dxa" w:w="2160"/>
           </w:tcPr>
           <w:p>
+            <w:pPr>
+              <w:jc w:val="left"/>
+            </w:pPr>
             <w:r>
+              <w:rPr>
+                <w:rFonts w:ascii="Arial" w:hAnsi="Arial"/>
+                <w:sz w:val="20"/>
+              </w:rPr>
               <w:t>up{job="..."}</w:t>
             </w:r>
           </w:p>
@@ -3053,7 +4199,14 @@
             <w:tcW w:type="dxa" w:w="2160"/>
           </w:tcPr>
           <w:p>
+            <w:pPr>
+              <w:jc w:val="left"/>
+            </w:pPr>
             <w:r>
+              <w:rPr>
+                <w:rFonts w:ascii="Arial" w:hAnsi="Arial"/>
+                <w:sz w:val="20"/>
+              </w:rPr>
               <w:t>Stat</w:t>
             </w:r>
           </w:p>
@@ -3065,7 +4218,14 @@
             <w:tcW w:type="dxa" w:w="2160"/>
           </w:tcPr>
           <w:p>
+            <w:pPr>
+              <w:jc w:val="left"/>
+            </w:pPr>
             <w:r>
+              <w:rPr>
+                <w:rFonts w:ascii="Arial" w:hAnsi="Arial"/>
+                <w:sz w:val="20"/>
+              </w:rPr>
               <w:t>2</w:t>
             </w:r>
           </w:p>
@@ -3075,7 +4235,14 @@
             <w:tcW w:type="dxa" w:w="2160"/>
           </w:tcPr>
           <w:p>
+            <w:pPr>
+              <w:jc w:val="left"/>
+            </w:pPr>
             <w:r>
+              <w:rPr>
+                <w:rFonts w:ascii="Arial" w:hAnsi="Arial"/>
+                <w:sz w:val="20"/>
+              </w:rPr>
               <w:t>Consumo de CPU (%)</w:t>
             </w:r>
           </w:p>
@@ -3085,7 +4252,14 @@
             <w:tcW w:type="dxa" w:w="2160"/>
           </w:tcPr>
           <w:p>
+            <w:pPr>
+              <w:jc w:val="left"/>
+            </w:pPr>
             <w:r>
+              <w:rPr>
+                <w:rFonts w:ascii="Arial" w:hAnsi="Arial"/>
+                <w:sz w:val="20"/>
+              </w:rPr>
               <w:t>rate(node_cpu_seconds_total{mode="idle"}[5m])</w:t>
             </w:r>
           </w:p>
@@ -3095,7 +4269,14 @@
             <w:tcW w:type="dxa" w:w="2160"/>
           </w:tcPr>
           <w:p>
+            <w:pPr>
+              <w:jc w:val="left"/>
+            </w:pPr>
             <w:r>
+              <w:rPr>
+                <w:rFonts w:ascii="Arial" w:hAnsi="Arial"/>
+                <w:sz w:val="20"/>
+              </w:rPr>
               <w:t>Timeseries</w:t>
             </w:r>
           </w:p>
@@ -3107,7 +4288,14 @@
             <w:tcW w:type="dxa" w:w="2160"/>
           </w:tcPr>
           <w:p>
+            <w:pPr>
+              <w:jc w:val="left"/>
+            </w:pPr>
             <w:r>
+              <w:rPr>
+                <w:rFonts w:ascii="Arial" w:hAnsi="Arial"/>
+                <w:sz w:val="20"/>
+              </w:rPr>
               <w:t>3</w:t>
             </w:r>
           </w:p>
@@ -3117,7 +4305,14 @@
             <w:tcW w:type="dxa" w:w="2160"/>
           </w:tcPr>
           <w:p>
+            <w:pPr>
+              <w:jc w:val="left"/>
+            </w:pPr>
             <w:r>
+              <w:rPr>
+                <w:rFonts w:ascii="Arial" w:hAnsi="Arial"/>
+                <w:sz w:val="20"/>
+              </w:rPr>
               <w:t>Consumo de Memoria (%)</w:t>
             </w:r>
           </w:p>
@@ -3127,7 +4322,14 @@
             <w:tcW w:type="dxa" w:w="2160"/>
           </w:tcPr>
           <w:p>
+            <w:pPr>
+              <w:jc w:val="left"/>
+            </w:pPr>
             <w:r>
+              <w:rPr>
+                <w:rFonts w:ascii="Arial" w:hAnsi="Arial"/>
+                <w:sz w:val="20"/>
+              </w:rPr>
               <w:t>(1 - node_memory_MemAvailable_bytes / node_memory_MemTotal_bytes)*100</w:t>
             </w:r>
           </w:p>
@@ -3137,7 +4339,14 @@
             <w:tcW w:type="dxa" w:w="2160"/>
           </w:tcPr>
           <w:p>
+            <w:pPr>
+              <w:jc w:val="left"/>
+            </w:pPr>
             <w:r>
+              <w:rPr>
+                <w:rFonts w:ascii="Arial" w:hAnsi="Arial"/>
+                <w:sz w:val="20"/>
+              </w:rPr>
               <w:t>Timeseries</w:t>
             </w:r>
           </w:p>
@@ -3149,7 +4358,14 @@
             <w:tcW w:type="dxa" w:w="2160"/>
           </w:tcPr>
           <w:p>
+            <w:pPr>
+              <w:jc w:val="left"/>
+            </w:pPr>
             <w:r>
+              <w:rPr>
+                <w:rFonts w:ascii="Arial" w:hAnsi="Arial"/>
+                <w:sz w:val="20"/>
+              </w:rPr>
               <w:t>4</w:t>
             </w:r>
           </w:p>
@@ -3159,7 +4375,14 @@
             <w:tcW w:type="dxa" w:w="2160"/>
           </w:tcPr>
           <w:p>
+            <w:pPr>
+              <w:jc w:val="left"/>
+            </w:pPr>
             <w:r>
+              <w:rPr>
+                <w:rFonts w:ascii="Arial" w:hAnsi="Arial"/>
+                <w:sz w:val="20"/>
+              </w:rPr>
               <w:t>Espacio en Disco</w:t>
             </w:r>
           </w:p>
@@ -3169,7 +4392,14 @@
             <w:tcW w:type="dxa" w:w="2160"/>
           </w:tcPr>
           <w:p>
+            <w:pPr>
+              <w:jc w:val="left"/>
+            </w:pPr>
             <w:r>
+              <w:rPr>
+                <w:rFonts w:ascii="Arial" w:hAnsi="Arial"/>
+                <w:sz w:val="20"/>
+              </w:rPr>
               <w:t>node_filesystem_*</w:t>
             </w:r>
           </w:p>
@@ -3179,7 +4409,14 @@
             <w:tcW w:type="dxa" w:w="2160"/>
           </w:tcPr>
           <w:p>
+            <w:pPr>
+              <w:jc w:val="left"/>
+            </w:pPr>
             <w:r>
+              <w:rPr>
+                <w:rFonts w:ascii="Arial" w:hAnsi="Arial"/>
+                <w:sz w:val="20"/>
+              </w:rPr>
               <w:t>Timeseries + Stat</w:t>
             </w:r>
           </w:p>
@@ -3191,7 +4428,14 @@
             <w:tcW w:type="dxa" w:w="2160"/>
           </w:tcPr>
           <w:p>
+            <w:pPr>
+              <w:jc w:val="left"/>
+            </w:pPr>
             <w:r>
+              <w:rPr>
+                <w:rFonts w:ascii="Arial" w:hAnsi="Arial"/>
+                <w:sz w:val="20"/>
+              </w:rPr>
               <w:t>5</w:t>
             </w:r>
           </w:p>
@@ -3201,7 +4445,14 @@
             <w:tcW w:type="dxa" w:w="2160"/>
           </w:tcPr>
           <w:p>
+            <w:pPr>
+              <w:jc w:val="left"/>
+            </w:pPr>
             <w:r>
+              <w:rPr>
+                <w:rFonts w:ascii="Arial" w:hAnsi="Arial"/>
+                <w:sz w:val="20"/>
+              </w:rPr>
               <w:t>Métricas MongoDB</w:t>
             </w:r>
           </w:p>
@@ -3211,7 +4462,14 @@
             <w:tcW w:type="dxa" w:w="2160"/>
           </w:tcPr>
           <w:p>
+            <w:pPr>
+              <w:jc w:val="left"/>
+            </w:pPr>
             <w:r>
+              <w:rPr>
+                <w:rFonts w:ascii="Arial" w:hAnsi="Arial"/>
+                <w:sz w:val="20"/>
+              </w:rPr>
               <w:t>mongodb_dbstats_dataSize, mongodb_connections, rate(mongodb_asserts_total)</w:t>
             </w:r>
           </w:p>
@@ -3221,7 +4479,14 @@
             <w:tcW w:type="dxa" w:w="2160"/>
           </w:tcPr>
           <w:p>
+            <w:pPr>
+              <w:jc w:val="left"/>
+            </w:pPr>
             <w:r>
+              <w:rPr>
+                <w:rFonts w:ascii="Arial" w:hAnsi="Arial"/>
+                <w:sz w:val="20"/>
+              </w:rPr>
               <w:t>Stat + Timeseries</w:t>
             </w:r>
           </w:p>
@@ -3233,7 +4498,14 @@
             <w:tcW w:type="dxa" w:w="2160"/>
           </w:tcPr>
           <w:p>
+            <w:pPr>
+              <w:jc w:val="left"/>
+            </w:pPr>
             <w:r>
+              <w:rPr>
+                <w:rFonts w:ascii="Arial" w:hAnsi="Arial"/>
+                <w:sz w:val="20"/>
+              </w:rPr>
               <w:t>6</w:t>
             </w:r>
           </w:p>
@@ -3243,7 +4515,14 @@
             <w:tcW w:type="dxa" w:w="2160"/>
           </w:tcPr>
           <w:p>
+            <w:pPr>
+              <w:jc w:val="left"/>
+            </w:pPr>
             <w:r>
+              <w:rPr>
+                <w:rFonts w:ascii="Arial" w:hAnsi="Arial"/>
+                <w:sz w:val="20"/>
+              </w:rPr>
               <w:t>Métricas Backend JVM</w:t>
             </w:r>
           </w:p>
@@ -3253,7 +4532,14 @@
             <w:tcW w:type="dxa" w:w="2160"/>
           </w:tcPr>
           <w:p>
+            <w:pPr>
+              <w:jc w:val="left"/>
+            </w:pPr>
             <w:r>
+              <w:rPr>
+                <w:rFonts w:ascii="Arial" w:hAnsi="Arial"/>
+                <w:sz w:val="20"/>
+              </w:rPr>
               <w:t>jvm_memory_committed_bytes, http_server_requests_seconds_*</w:t>
             </w:r>
           </w:p>
@@ -3263,7 +4549,14 @@
             <w:tcW w:type="dxa" w:w="2160"/>
           </w:tcPr>
           <w:p>
+            <w:pPr>
+              <w:jc w:val="left"/>
+            </w:pPr>
             <w:r>
+              <w:rPr>
+                <w:rFonts w:ascii="Arial" w:hAnsi="Arial"/>
+                <w:sz w:val="20"/>
+              </w:rPr>
               <w:t>Timeseries</w:t>
             </w:r>
           </w:p>
@@ -3275,7 +4568,14 @@
             <w:tcW w:type="dxa" w:w="2160"/>
           </w:tcPr>
           <w:p>
+            <w:pPr>
+              <w:jc w:val="left"/>
+            </w:pPr>
             <w:r>
+              <w:rPr>
+                <w:rFonts w:ascii="Arial" w:hAnsi="Arial"/>
+                <w:sz w:val="20"/>
+              </w:rPr>
               <w:t>7</w:t>
             </w:r>
           </w:p>
@@ -3285,7 +4585,14 @@
             <w:tcW w:type="dxa" w:w="2160"/>
           </w:tcPr>
           <w:p>
+            <w:pPr>
+              <w:jc w:val="left"/>
+            </w:pPr>
             <w:r>
+              <w:rPr>
+                <w:rFonts w:ascii="Arial" w:hAnsi="Arial"/>
+                <w:sz w:val="20"/>
+              </w:rPr>
               <w:t>Alertas Activas</w:t>
             </w:r>
           </w:p>
@@ -3295,7 +4602,14 @@
             <w:tcW w:type="dxa" w:w="2160"/>
           </w:tcPr>
           <w:p>
+            <w:pPr>
+              <w:jc w:val="left"/>
+            </w:pPr>
             <w:r>
+              <w:rPr>
+                <w:rFonts w:ascii="Arial" w:hAnsi="Arial"/>
+                <w:sz w:val="20"/>
+              </w:rPr>
               <w:t>ALERTS{alertstate="firing"}</w:t>
             </w:r>
           </w:p>
@@ -3305,7 +4619,14 @@
             <w:tcW w:type="dxa" w:w="2160"/>
           </w:tcPr>
           <w:p>
+            <w:pPr>
+              <w:jc w:val="left"/>
+            </w:pPr>
             <w:r>
+              <w:rPr>
+                <w:rFonts w:ascii="Arial" w:hAnsi="Arial"/>
+                <w:sz w:val="20"/>
+              </w:rPr>
               <w:t>Stat</w:t>
             </w:r>
           </w:p>
@@ -3325,7 +4646,7 @@
         <w:drawing>
           <wp:inline xmlns:a="http://schemas.openxmlformats.org/drawingml/2006/main" xmlns:pic="http://schemas.openxmlformats.org/drawingml/2006/picture">
             <wp:extent cx="5029200" cy="5303008"/>
-            <wp:docPr id="3" name="Picture 3"/>
+            <wp:docPr id="9" name="Picture 9"/>
             <wp:cNvGraphicFramePr>
               <a:graphicFrameLocks noChangeAspect="1"/>
             </wp:cNvGraphicFramePr>
@@ -3333,7 +4654,7 @@
               <a:graphicData uri="http://schemas.openxmlformats.org/drawingml/2006/picture">
                 <pic:pic>
                   <pic:nvPicPr>
-                    <pic:cNvPr id="0" name="grafana-dashboard-2.png"/>
+                    <pic:cNvPr id="0" name="image.png"/>
                     <pic:cNvPicPr/>
                   </pic:nvPicPr>
                   <pic:blipFill>
@@ -3365,21 +4686,11 @@
       </w:r>
     </w:p>
     <w:p>
-      <w:r>
-        <w:t>[CAPTURA: Gráfico de CPU con las líneas de los 3 servidores]</w:t>
-      </w:r>
-    </w:p>
-    <w:p>
       <w:pPr>
         <w:pStyle w:val="Heading2"/>
       </w:pPr>
       <w:r>
         <w:t>5.3. Consumo de Memoria - Comparativa</w:t>
-      </w:r>
-    </w:p>
-    <w:p>
-      <w:r>
-        <w:t>[CAPTURA: Gráfico de memoria con las líneas de los 3 servidores]</w:t>
       </w:r>
     </w:p>
     <w:p>
@@ -3391,21 +4702,11 @@
       </w:r>
     </w:p>
     <w:p>
-      <w:r>
-        <w:t>[CAPTURA: Gráfico de disco con las líneas de los 3 servidores]</w:t>
-      </w:r>
-    </w:p>
-    <w:p>
       <w:pPr>
         <w:pStyle w:val="Heading2"/>
       </w:pPr>
       <w:r>
         <w:t>5.5. Métricas de MongoDB</w:t>
-      </w:r>
-    </w:p>
-    <w:p>
-      <w:r>
-        <w:t>[CAPTURA: Panel de MongoDB con tamaño de BD, conexiones activas y operaciones por segundo]</w:t>
       </w:r>
     </w:p>
     <w:p>
@@ -3417,21 +4718,11 @@
       </w:r>
     </w:p>
     <w:p>
-      <w:r>
-        <w:t>[CAPTURA: Panel del Backend con Heap, Non-Heap, HTTP Requests Rate y Tiempo de Respuesta Promedio]</w:t>
-      </w:r>
-    </w:p>
-    <w:p>
       <w:pPr>
         <w:pStyle w:val="Heading2"/>
       </w:pPr>
       <w:r>
         <w:t>5.7. Alertas Visuales</w:t>
-      </w:r>
-    </w:p>
-    <w:p>
-      <w:r>
-        <w:t>[CAPTURA: Panel de alertas activas en el dashboard]</w:t>
       </w:r>
     </w:p>
     <w:p>
@@ -3944,7 +5235,7 @@
     </w:p>
     <w:sectPr>
       <w:pgSz w:w="12240" w:h="15840"/>
-      <w:pgMar w:top="1440" w:right="1800" w:bottom="1440" w:left="1800" w:header="720" w:footer="720" w:gutter="0"/>
+      <w:pgMar w:top="1440" w:right="1440" w:bottom="1440" w:left="1440" w:header="720" w:footer="720" w:gutter="0"/>
       <w:cols w:space="720"/>
       <w:docGrid w:linePitch="360"/>
     </w:sectPr>
@@ -4316,11 +5607,12 @@
     <w:qFormat/>
     <w:rsid w:val="00FC693F"/>
     <w:pPr>
-      <w:spacing w:after="120"/>
+      <w:spacing w:after="120" w:before="0" w:line="360" w:lineRule="auto"/>
       <w:jc w:val="both"/>
     </w:pPr>
     <w:rPr>
       <w:rFonts w:ascii="Arial" w:hAnsi="Arial"/>
+      <w:color w:val="000000"/>
       <w:sz w:val="22"/>
     </w:rPr>
   </w:style>
@@ -4379,15 +5671,16 @@
     <w:pPr>
       <w:keepNext/>
       <w:keepLines/>
-      <w:spacing w:before="480" w:after="0"/>
+      <w:spacing w:before="360" w:after="240" w:line="360" w:lineRule="auto"/>
+      <w:jc w:val="center"/>
       <w:outlineLvl w:val="0"/>
     </w:pPr>
     <w:rPr>
-      <w:rFonts w:asciiTheme="majorHAnsi" w:eastAsiaTheme="majorEastAsia" w:hAnsiTheme="majorHAnsi" w:cstheme="majorBidi"/>
+      <w:rFonts w:asciiTheme="majorHAnsi" w:eastAsiaTheme="majorEastAsia" w:hAnsiTheme="majorHAnsi" w:cstheme="majorBidi" w:ascii="Arial" w:hAnsi="Arial"/>
       <w:b/>
       <w:bCs/>
-      <w:color w:val="365F91" w:themeColor="accent1" w:themeShade="BF"/>
-      <w:sz w:val="28"/>
+      <w:color w:val="000000"/>
+      <w:sz w:val="24"/>
       <w:szCs w:val="28"/>
     </w:rPr>
   </w:style>
@@ -4403,15 +5696,16 @@
     <w:pPr>
       <w:keepNext/>
       <w:keepLines/>
-      <w:spacing w:before="200" w:after="0"/>
+      <w:spacing w:before="240" w:after="120" w:line="360" w:lineRule="auto"/>
+      <w:jc w:val="left"/>
       <w:outlineLvl w:val="1"/>
     </w:pPr>
     <w:rPr>
-      <w:rFonts w:asciiTheme="majorHAnsi" w:eastAsiaTheme="majorEastAsia" w:hAnsiTheme="majorHAnsi" w:cstheme="majorBidi"/>
+      <w:rFonts w:asciiTheme="majorHAnsi" w:eastAsiaTheme="majorEastAsia" w:hAnsiTheme="majorHAnsi" w:cstheme="majorBidi" w:ascii="Arial" w:hAnsi="Arial"/>
       <w:b/>
       <w:bCs/>
-      <w:color w:val="4F81BD" w:themeColor="accent1"/>
-      <w:sz w:val="26"/>
+      <w:color w:val="000000"/>
+      <w:sz w:val="24"/>
       <w:szCs w:val="26"/>
     </w:rPr>
   </w:style>
@@ -4427,14 +5721,17 @@
     <w:pPr>
       <w:keepNext/>
       <w:keepLines/>
-      <w:spacing w:before="200" w:after="0"/>
+      <w:spacing w:before="200" w:after="80" w:line="360" w:lineRule="auto"/>
+      <w:jc w:val="left"/>
       <w:outlineLvl w:val="2"/>
     </w:pPr>
     <w:rPr>
-      <w:rFonts w:asciiTheme="majorHAnsi" w:eastAsiaTheme="majorEastAsia" w:hAnsiTheme="majorHAnsi" w:cstheme="majorBidi"/>
+      <w:rFonts w:asciiTheme="majorHAnsi" w:eastAsiaTheme="majorEastAsia" w:hAnsiTheme="majorHAnsi" w:cstheme="majorBidi" w:ascii="Arial" w:hAnsi="Arial"/>
       <w:b/>
       <w:bCs/>
-      <w:color w:val="4F81BD" w:themeColor="accent1"/>
+      <w:i/>
+      <w:color w:val="000000"/>
+      <w:sz w:val="22"/>
     </w:rPr>
   </w:style>
   <w:style w:type="paragraph" w:styleId="Heading4">
@@ -4850,8 +6147,14 @@
       <w:numPr>
         <w:numId w:val="1"/>
       </w:numPr>
+      <w:spacing w:line="360" w:lineRule="auto"/>
       <w:contextualSpacing/>
+      <w:jc w:val="both"/>
     </w:pPr>
+    <w:rPr>
+      <w:rFonts w:ascii="Arial" w:hAnsi="Arial"/>
+      <w:sz w:val="22"/>
+    </w:rPr>
   </w:style>
   <w:style w:type="paragraph" w:styleId="ListBullet2">
     <w:name w:val="List Bullet 2"/>

</xml_diff>